<commit_message>
F3: corrige interpretacion de errores Low/High y depura referencias APA
</commit_message>
<xml_diff>
--- a/MCDI504/docs/MCDI504_S3_2_GRUPO5.docx
+++ b/MCDI504/docs/MCDI504_S3_2_GRUPO5.docx
@@ -1,6 +1,6 @@
 
 <file path=word/document.xml><?xml version="1.0" encoding="utf-8"?>
-<w:document xmlns:wpc="http://schemas.microsoft.com/office/word/2010/wordprocessingCanvas" xmlns:cx="http://schemas.microsoft.com/office/drawing/2014/chartex" xmlns:cx1="http://schemas.microsoft.com/office/drawing/2015/9/8/chartex" xmlns:cx2="http://schemas.microsoft.com/office/drawing/2015/10/21/chartex" xmlns:cx3="http://schemas.microsoft.com/office/drawing/2016/5/9/chartex" xmlns:cx4="http://schemas.microsoft.com/office/drawing/2016/5/10/chartex" xmlns:cx5="http://schemas.microsoft.com/office/drawing/2016/5/11/chartex" xmlns:cx6="http://schemas.microsoft.com/office/drawing/2016/5/12/chartex" xmlns:cx7="http://schemas.microsoft.com/office/drawing/2016/5/13/chartex" xmlns:cx8="http://schemas.microsoft.com/office/drawing/2016/5/14/chartex" xmlns:mc="http://schemas.openxmlformats.org/markup-compatibility/2006" xmlns:m="http://schemas.openxmlformats.org/officeDocument/2006/math" xmlns:aink="http://schemas.microsoft.com/office/drawing/2016/ink" xmlns:am3d="http://schemas.microsoft.com/office/drawing/2017/model3d" xmlns:oel="http://schemas.microsoft.com/office/2019/extlst" xmlns:r="http://schemas.openxmlformats.org/officeDocument/2006/relationships" xmlns:wp14="http://schemas.microsoft.com/office/word/2010/wordprocessingDrawing" xmlns:wp="http://schemas.openxmlformats.org/drawingml/2006/wordprocessingDrawing" xmlns:wpg="http://schemas.microsoft.com/office/word/2010/wordprocessingGroup" xmlns:wpi="http://schemas.microsoft.com/office/word/2010/wordprocessingInk" xmlns:wps="http://schemas.microsoft.com/office/word/2010/wordprocessingShape" xmlns:o="urn:schemas-microsoft-com:office:office" xmlns:v="urn:schemas-microsoft-com:vml" xmlns:w10="urn:schemas-microsoft-com:office:word" xmlns:w="http://schemas.openxmlformats.org/wordprocessingml/2006/main" xmlns:w14="http://schemas.microsoft.com/office/word/2010/wordml" xmlns:w15="http://schemas.microsoft.com/office/word/2012/wordml" xmlns:w16cex="http://schemas.microsoft.com/office/word/2018/wordml/cex" xmlns:w16cid="http://schemas.microsoft.com/office/word/2016/wordml/cid" xmlns:w16="http://schemas.microsoft.com/office/word/2018/wordml" xmlns:w16sdtdh="http://schemas.microsoft.com/office/word/2020/wordml/sdtdatahash" xmlns:w16sdtfl="http://schemas.microsoft.com/office/word/2024/wordml/sdtformatlock" xmlns:w16se="http://schemas.microsoft.com/office/word/2015/wordml/symex" xmlns:w16du="http://schemas.microsoft.com/office/word/2023/wordml/word16du" xmlns:wne="http://schemas.microsoft.com/office/word/2006/wordml" mc:Ignorable="w14 w15 w16se w16cid w16 w16cex w16sdtdh w16sdtfl w16du wp14">
+<w:document xmlns:wpc="http://schemas.microsoft.com/office/word/2010/wordprocessingCanvas" xmlns:cx="http://schemas.microsoft.com/office/drawing/2014/chartex" xmlns:cx1="http://schemas.microsoft.com/office/drawing/2015/9/8/chartex" xmlns:cx2="http://schemas.microsoft.com/office/drawing/2015/10/21/chartex" xmlns:cx3="http://schemas.microsoft.com/office/drawing/2016/5/9/chartex" xmlns:cx4="http://schemas.microsoft.com/office/drawing/2016/5/10/chartex" xmlns:cx5="http://schemas.microsoft.com/office/drawing/2016/5/11/chartex" xmlns:cx6="http://schemas.microsoft.com/office/drawing/2016/5/12/chartex" xmlns:cx7="http://schemas.microsoft.com/office/drawing/2016/5/13/chartex" xmlns:cx8="http://schemas.microsoft.com/office/drawing/2016/5/14/chartex" xmlns:mc="http://schemas.openxmlformats.org/markup-compatibility/2006" xmlns:aink="http://schemas.microsoft.com/office/drawing/2016/ink" xmlns:am3d="http://schemas.microsoft.com/office/drawing/2017/model3d" xmlns:o="urn:schemas-microsoft-com:office:office" xmlns:oel="http://schemas.microsoft.com/office/2019/extlst" xmlns:r="http://schemas.openxmlformats.org/officeDocument/2006/relationships" xmlns:m="http://schemas.openxmlformats.org/officeDocument/2006/math" xmlns:v="urn:schemas-microsoft-com:vml" xmlns:wp14="http://schemas.microsoft.com/office/word/2010/wordprocessingDrawing" xmlns:wp="http://schemas.openxmlformats.org/drawingml/2006/wordprocessingDrawing" xmlns:w10="urn:schemas-microsoft-com:office:word" xmlns:w="http://schemas.openxmlformats.org/wordprocessingml/2006/main" xmlns:w14="http://schemas.microsoft.com/office/word/2010/wordml" xmlns:w15="http://schemas.microsoft.com/office/word/2012/wordml" xmlns:w16cex="http://schemas.microsoft.com/office/word/2018/wordml/cex" xmlns:w16cid="http://schemas.microsoft.com/office/word/2016/wordml/cid" xmlns:w16="http://schemas.microsoft.com/office/word/2018/wordml" xmlns:w16du="http://schemas.microsoft.com/office/word/2023/wordml/word16du" xmlns:w16sdtdh="http://schemas.microsoft.com/office/word/2020/wordml/sdtdatahash" xmlns:w16sdtfl="http://schemas.microsoft.com/office/word/2024/wordml/sdtformatlock" xmlns:w16se="http://schemas.microsoft.com/office/word/2015/wordml/symex" xmlns:wpg="http://schemas.microsoft.com/office/word/2010/wordprocessingGroup" xmlns:wpi="http://schemas.microsoft.com/office/word/2010/wordprocessingInk" xmlns:wne="http://schemas.microsoft.com/office/word/2006/wordml" xmlns:wps="http://schemas.microsoft.com/office/word/2010/wordprocessingShape" mc:Ignorable="w14 w15 w16se w16cid w16 w16cex w16sdtdh w16sdtfl w16du wp14">
   <w:body>
     <w:p>
       <w:pPr>
@@ -100,7 +100,7 @@
     </w:p>
     <w:p>
       <w:pPr>
-        <w:pStyle w:val="ListBullet"/>
+        <w:pStyle w:val="Listaconvietas"/>
         <w:spacing w:after="80"/>
       </w:pPr>
       <w:r>
@@ -109,7 +109,7 @@
     </w:p>
     <w:p>
       <w:pPr>
-        <w:pStyle w:val="ListBullet"/>
+        <w:pStyle w:val="Listaconvietas"/>
         <w:spacing w:after="80"/>
       </w:pPr>
       <w:r>
@@ -118,7 +118,7 @@
     </w:p>
     <w:p>
       <w:pPr>
-        <w:pStyle w:val="ListBullet"/>
+        <w:pStyle w:val="Listaconvietas"/>
         <w:spacing w:after="80"/>
       </w:pPr>
       <w:r>
@@ -127,7 +127,7 @@
     </w:p>
     <w:p>
       <w:pPr>
-        <w:pStyle w:val="ListBullet"/>
+        <w:pStyle w:val="Listaconvietas"/>
         <w:spacing w:after="80"/>
       </w:pPr>
       <w:r>
@@ -136,7 +136,7 @@
     </w:p>
     <w:p>
       <w:pPr>
-        <w:pStyle w:val="ListBullet"/>
+        <w:pStyle w:val="Listaconvietas"/>
         <w:numPr>
           <w:ilvl w:val="0"/>
           <w:numId w:val="0"/>
@@ -146,7 +146,7 @@
     </w:p>
     <w:p>
       <w:pPr>
-        <w:pStyle w:val="ListBullet"/>
+        <w:pStyle w:val="Listaconvietas"/>
         <w:numPr>
           <w:ilvl w:val="0"/>
           <w:numId w:val="0"/>
@@ -347,12 +347,63 @@
         <w:jc w:val="both"/>
       </w:pPr>
       <w:r>
-        <w:t>Desde la perspectiva metodológica, esta fase busca generar evidencia técnica para la toma de decisiones de NextWork Advisory: no basta con entrenar los tres modelos, sino que se deben interpretar sus resultados, contrastar sus métricas y justificar qué arquitectura resulta más pertinente para continuar el proyecto. Esta lógica se sostiene en la evaluación integrada de accuracy, precision, recall y F1-score (promediados de forma macro para no sobrestimar el desempeño por la clase mayoritaria), que en conjunto permiten leer la capacidad de las redes neuronales para distinguir las tres categorías de riesgo de automatización (Ruete, 2026b).</w:t>
+        <w:t xml:space="preserve">Desde la perspectiva metodológica, esta fase busca generar evidencia técnica para la toma de decisiones de NextWork Advisory: no basta con entrenar los tres modelos, sino que se deben interpretar sus resultados, contrastar sus métricas y justificar qué arquitectura resulta más pertinente para continuar el proyecto. Esta lógica se sostiene en la evaluación integrada de accuracy, precision, recall y F1-score (promediados de forma macro para no sobrestimar el desempeño por la clase mayoritaria), que en conjunto permiten leer la capacidad de las redes neuronales para </w:t>
+      </w:r>
+      <w:proofErr w:type="spellStart"/>
+      <w:r>
+        <w:t>distinguir</w:t>
+      </w:r>
+      <w:proofErr w:type="spellEnd"/>
+      <w:r>
+        <w:t xml:space="preserve"> las </w:t>
+      </w:r>
+      <w:proofErr w:type="spellStart"/>
+      <w:r>
+        <w:t>tres</w:t>
+      </w:r>
+      <w:proofErr w:type="spellEnd"/>
+      <w:r>
+        <w:t xml:space="preserve"> </w:t>
+      </w:r>
+      <w:proofErr w:type="spellStart"/>
+      <w:r>
+        <w:t>categorías</w:t>
+      </w:r>
+      <w:proofErr w:type="spellEnd"/>
+      <w:r>
+        <w:t xml:space="preserve"> de </w:t>
+      </w:r>
+      <w:proofErr w:type="spellStart"/>
+      <w:r>
+        <w:t>riesgo</w:t>
+      </w:r>
+      <w:proofErr w:type="spellEnd"/>
+      <w:r>
+        <w:t xml:space="preserve"> de </w:t>
+      </w:r>
+      <w:proofErr w:type="spellStart"/>
+      <w:r>
+        <w:t>automatización</w:t>
+      </w:r>
+      <w:proofErr w:type="spellEnd"/>
+      <w:r>
+        <w:t xml:space="preserve"> (</w:t>
+      </w:r>
+      <w:proofErr w:type="spellStart"/>
+      <w:r>
+        <w:t>Ruete</w:t>
+      </w:r>
+      <w:proofErr w:type="spellEnd"/>
+      <w:r>
+        <w:t>, 2026a; scikit-learn Developers, 2026a)</w:t>
+      </w:r>
+      <w:r>
+        <w:t>.</w:t>
       </w:r>
     </w:p>
     <w:tbl>
       <w:tblPr>
-        <w:tblStyle w:val="TableGrid"/>
+        <w:tblStyle w:val="Tablaconcuadrcula"/>
         <w:tblW w:w="0" w:type="auto"/>
         <w:jc w:val="center"/>
         <w:tblLook w:val="04A0" w:firstRow="1" w:lastRow="0" w:firstColumn="1" w:lastColumn="0" w:noHBand="0" w:noVBand="1"/>
@@ -648,7 +699,7 @@
     </w:p>
     <w:tbl>
       <w:tblPr>
-        <w:tblStyle w:val="TableGrid"/>
+        <w:tblStyle w:val="Tablaconcuadrcula"/>
         <w:tblW w:w="0" w:type="auto"/>
         <w:jc w:val="center"/>
         <w:tblLook w:val="04A0" w:firstRow="1" w:lastRow="0" w:firstColumn="1" w:lastColumn="0" w:noHBand="0" w:noVBand="1"/>
@@ -1155,7 +1206,7 @@
     </w:p>
     <w:p>
       <w:pPr>
-        <w:pStyle w:val="ListBullet"/>
+        <w:pStyle w:val="Listaconvietas"/>
         <w:spacing w:after="80"/>
       </w:pPr>
       <w:r>
@@ -1164,7 +1215,7 @@
     </w:p>
     <w:p>
       <w:pPr>
-        <w:pStyle w:val="ListBullet"/>
+        <w:pStyle w:val="Listaconvietas"/>
         <w:spacing w:after="80"/>
       </w:pPr>
       <w:r>
@@ -1177,7 +1228,7 @@
     </w:p>
     <w:p>
       <w:pPr>
-        <w:pStyle w:val="ListBullet"/>
+        <w:pStyle w:val="Listaconvietas"/>
         <w:spacing w:after="80"/>
       </w:pPr>
       <w:r>
@@ -1195,7 +1246,7 @@
     </w:p>
     <w:tbl>
       <w:tblPr>
-        <w:tblStyle w:val="TableGrid"/>
+        <w:tblStyle w:val="Tablaconcuadrcula"/>
         <w:tblW w:w="0" w:type="auto"/>
         <w:jc w:val="center"/>
         <w:tblLook w:val="04A0" w:firstRow="1" w:lastRow="0" w:firstColumn="1" w:lastColumn="0" w:noHBand="0" w:noVBand="1"/>
@@ -1696,7 +1747,7 @@
     </w:p>
     <w:tbl>
       <w:tblPr>
-        <w:tblStyle w:val="TableGrid"/>
+        <w:tblStyle w:val="Tablaconcuadrcula"/>
         <w:tblW w:w="0" w:type="auto"/>
         <w:jc w:val="center"/>
         <w:tblLook w:val="04A0" w:firstRow="1" w:lastRow="0" w:firstColumn="1" w:lastColumn="0" w:noHBand="0" w:noVBand="1"/>
@@ -1890,12 +1941,79 @@
         <w:jc w:val="both"/>
       </w:pPr>
       <w:r>
-        <w:t>Las variables predictoras presentan escalas muy distintas (Average_Salary en decenas de miles de dólares versus índices, habilidades y dummies de Job_Title entre 0 y 1). Las redes neuronales entrenadas mediante descenso de gradiente (optimizador adam, usado por MLPClassifier) son particularmente sensibles a la escala de los datos de entrada: variables con rangos mucho mayores dominan el cálculo del gradiente y ralentizan o distorsionan la convergencia. Por ello se estandarizan los predictores con StandardScaler (media 0, desviación estándar 1), ajustado únicamente con los datos de entrenamiento para evitar fuga de información desde el conjunto de prueba, replicando el criterio ya utilizado para el MLP de regresión en la Fase 2 (Ruete, 2026a; scikit-learn Developers, 2026b).</w:t>
+        <w:t xml:space="preserve">Las variables predictoras presentan escalas muy distintas (Average_Salary en decenas de miles de dólares versus índices, habilidades y dummies de Job_Title entre 0 y 1). Las redes neuronales entrenadas mediante descenso de gradiente (optimizador adam, usado por MLPClassifier) son particularmente sensibles a la escala de los datos de entrada: variables con rangos mucho mayores dominan el cálculo del gradiente y ralentizan o distorsionan la convergencia. Por ello se estandarizan los predictores con StandardScaler (media 0, desviación estándar 1), ajustado únicamente con los datos de entrenamiento para evitar fuga de información desde el conjunto de </w:t>
+      </w:r>
+      <w:proofErr w:type="spellStart"/>
+      <w:r>
+        <w:t>prueba</w:t>
+      </w:r>
+      <w:proofErr w:type="spellEnd"/>
+      <w:r>
+        <w:t xml:space="preserve">, </w:t>
+      </w:r>
+      <w:proofErr w:type="spellStart"/>
+      <w:r>
+        <w:t>replicando</w:t>
+      </w:r>
+      <w:proofErr w:type="spellEnd"/>
+      <w:r>
+        <w:t xml:space="preserve"> el </w:t>
+      </w:r>
+      <w:proofErr w:type="spellStart"/>
+      <w:r>
+        <w:t>criterio</w:t>
+      </w:r>
+      <w:proofErr w:type="spellEnd"/>
+      <w:r>
+        <w:t xml:space="preserve"> </w:t>
+      </w:r>
+      <w:proofErr w:type="spellStart"/>
+      <w:r>
+        <w:t>ya</w:t>
+      </w:r>
+      <w:proofErr w:type="spellEnd"/>
+      <w:r>
+        <w:t xml:space="preserve"> </w:t>
+      </w:r>
+      <w:proofErr w:type="spellStart"/>
+      <w:r>
+        <w:t>utilizado</w:t>
+      </w:r>
+      <w:proofErr w:type="spellEnd"/>
+      <w:r>
+        <w:t xml:space="preserve"> para el MLP de </w:t>
+      </w:r>
+      <w:proofErr w:type="spellStart"/>
+      <w:r>
+        <w:t>regresión</w:t>
+      </w:r>
+      <w:proofErr w:type="spellEnd"/>
+      <w:r>
+        <w:t xml:space="preserve"> </w:t>
+      </w:r>
+      <w:proofErr w:type="spellStart"/>
+      <w:r>
+        <w:t>en</w:t>
+      </w:r>
+      <w:proofErr w:type="spellEnd"/>
+      <w:r>
+        <w:t xml:space="preserve"> la Fase 2 (</w:t>
+      </w:r>
+      <w:proofErr w:type="spellStart"/>
+      <w:r>
+        <w:t>Ruete</w:t>
+      </w:r>
+      <w:proofErr w:type="spellEnd"/>
+      <w:r>
+        <w:t>, 2026b; scikit-learn Developers, 2026b)</w:t>
+      </w:r>
+      <w:r>
+        <w:t>.</w:t>
       </w:r>
     </w:p>
     <w:tbl>
       <w:tblPr>
-        <w:tblStyle w:val="TableGrid"/>
+        <w:tblStyle w:val="Tablaconcuadrcula"/>
         <w:tblW w:w="0" w:type="auto"/>
         <w:jc w:val="center"/>
         <w:tblLook w:val="04A0" w:firstRow="1" w:lastRow="0" w:firstColumn="1" w:lastColumn="0" w:noHBand="0" w:noVBand="1"/>
@@ -2217,7 +2335,7 @@
     </w:p>
     <w:tbl>
       <w:tblPr>
-        <w:tblStyle w:val="TableGrid"/>
+        <w:tblStyle w:val="Tablaconcuadrcula"/>
         <w:tblW w:w="0" w:type="auto"/>
         <w:jc w:val="center"/>
         <w:tblLook w:val="04A0" w:firstRow="1" w:lastRow="0" w:firstColumn="1" w:lastColumn="0" w:noHBand="0" w:noVBand="1"/>
@@ -2610,7 +2728,7 @@
     </w:p>
     <w:p>
       <w:pPr>
-        <w:pStyle w:val="ListBullet"/>
+        <w:pStyle w:val="Listaconvietas"/>
         <w:spacing w:after="80"/>
       </w:pPr>
       <w:r>
@@ -2619,7 +2737,7 @@
     </w:p>
     <w:p>
       <w:pPr>
-        <w:pStyle w:val="ListBullet"/>
+        <w:pStyle w:val="Listaconvietas"/>
         <w:spacing w:after="80"/>
       </w:pPr>
       <w:r>
@@ -2628,7 +2746,7 @@
     </w:p>
     <w:p>
       <w:pPr>
-        <w:pStyle w:val="ListBullet"/>
+        <w:pStyle w:val="Listaconvietas"/>
         <w:spacing w:after="80"/>
       </w:pPr>
       <w:r>
@@ -2666,7 +2784,7 @@
     </w:p>
     <w:tbl>
       <w:tblPr>
-        <w:tblStyle w:val="TableGrid"/>
+        <w:tblStyle w:val="Tablaconcuadrcula"/>
         <w:tblW w:w="0" w:type="auto"/>
         <w:jc w:val="center"/>
         <w:tblLook w:val="04A0" w:firstRow="1" w:lastRow="0" w:firstColumn="1" w:lastColumn="0" w:noHBand="0" w:noVBand="1"/>
@@ -3173,7 +3291,7 @@
     </w:p>
     <w:tbl>
       <w:tblPr>
-        <w:tblStyle w:val="TableGrid"/>
+        <w:tblStyle w:val="Tablaconcuadrcula"/>
         <w:tblW w:w="0" w:type="auto"/>
         <w:jc w:val="center"/>
         <w:tblLook w:val="04A0" w:firstRow="1" w:lastRow="0" w:firstColumn="1" w:lastColumn="0" w:noHBand="0" w:noVBand="1"/>
@@ -3432,7 +3550,375 @@
         <w:jc w:val="both"/>
       </w:pPr>
       <w:r>
-        <w:t>El proyecto declara sus dependencias principales (pandas, NumPy, scikit-learn, Matplotlib, Seaborn) en requirements.txt, lo que fortalece la reproducibilidad y permite que cualquier integrante del equipo ejecute el mismo flujo analítico y obtenga resultados idénticos, dado el uso consistente de random_state=42 en las tres arquitecturas de red neuronal.</w:t>
+        <w:t xml:space="preserve">La </w:t>
+      </w:r>
+      <w:proofErr w:type="spellStart"/>
+      <w:r>
+        <w:t>totalidad</w:t>
+      </w:r>
+      <w:proofErr w:type="spellEnd"/>
+      <w:r>
+        <w:t xml:space="preserve"> del </w:t>
+      </w:r>
+      <w:proofErr w:type="spellStart"/>
+      <w:r>
+        <w:t>modelamiento</w:t>
+      </w:r>
+      <w:proofErr w:type="spellEnd"/>
+      <w:r>
+        <w:t xml:space="preserve"> se </w:t>
+      </w:r>
+      <w:proofErr w:type="spellStart"/>
+      <w:r>
+        <w:t>implementa</w:t>
+      </w:r>
+      <w:proofErr w:type="spellEnd"/>
+      <w:r>
+        <w:t xml:space="preserve"> </w:t>
+      </w:r>
+      <w:proofErr w:type="spellStart"/>
+      <w:r>
+        <w:t>sobre</w:t>
+      </w:r>
+      <w:proofErr w:type="spellEnd"/>
+      <w:r>
+        <w:t xml:space="preserve"> scikit-learn (Pedregosa et al., 2011), </w:t>
+      </w:r>
+      <w:proofErr w:type="spellStart"/>
+      <w:r>
+        <w:t>cuya</w:t>
+      </w:r>
+      <w:proofErr w:type="spellEnd"/>
+      <w:r>
+        <w:t xml:space="preserve"> </w:t>
+      </w:r>
+      <w:proofErr w:type="spellStart"/>
+      <w:r>
+        <w:t>interfaz</w:t>
+      </w:r>
+      <w:proofErr w:type="spellEnd"/>
+      <w:r>
+        <w:t xml:space="preserve"> </w:t>
+      </w:r>
+      <w:proofErr w:type="spellStart"/>
+      <w:r>
+        <w:t>común</w:t>
+      </w:r>
+      <w:proofErr w:type="spellEnd"/>
+      <w:r>
+        <w:t xml:space="preserve"> de </w:t>
+      </w:r>
+      <w:proofErr w:type="spellStart"/>
+      <w:r>
+        <w:t>estimadores</w:t>
+      </w:r>
+      <w:proofErr w:type="spellEnd"/>
+      <w:r>
+        <w:t xml:space="preserve"> </w:t>
+      </w:r>
+      <w:proofErr w:type="spellStart"/>
+      <w:r>
+        <w:t>permite</w:t>
+      </w:r>
+      <w:proofErr w:type="spellEnd"/>
+      <w:r>
+        <w:t xml:space="preserve"> </w:t>
+      </w:r>
+      <w:proofErr w:type="spellStart"/>
+      <w:r>
+        <w:t>entrenar</w:t>
+      </w:r>
+      <w:proofErr w:type="spellEnd"/>
+      <w:r>
+        <w:t xml:space="preserve"> y </w:t>
+      </w:r>
+      <w:proofErr w:type="spellStart"/>
+      <w:r>
+        <w:t>evaluar</w:t>
+      </w:r>
+      <w:proofErr w:type="spellEnd"/>
+      <w:r>
+        <w:t xml:space="preserve"> las </w:t>
+      </w:r>
+      <w:proofErr w:type="spellStart"/>
+      <w:r>
+        <w:t>tres</w:t>
+      </w:r>
+      <w:proofErr w:type="spellEnd"/>
+      <w:r>
+        <w:t xml:space="preserve"> </w:t>
+      </w:r>
+      <w:proofErr w:type="spellStart"/>
+      <w:r>
+        <w:t>arquitecturas</w:t>
+      </w:r>
+      <w:proofErr w:type="spellEnd"/>
+      <w:r>
+        <w:t xml:space="preserve"> con el </w:t>
+      </w:r>
+      <w:proofErr w:type="spellStart"/>
+      <w:r>
+        <w:t>mismo</w:t>
+      </w:r>
+      <w:proofErr w:type="spellEnd"/>
+      <w:r>
+        <w:t xml:space="preserve"> </w:t>
+      </w:r>
+      <w:proofErr w:type="spellStart"/>
+      <w:r>
+        <w:t>flujo</w:t>
+      </w:r>
+      <w:proofErr w:type="spellEnd"/>
+      <w:r>
+        <w:t xml:space="preserve"> de </w:t>
+      </w:r>
+      <w:proofErr w:type="spellStart"/>
+      <w:r>
+        <w:t>código</w:t>
+      </w:r>
+      <w:proofErr w:type="spellEnd"/>
+      <w:r>
+        <w:t xml:space="preserve">, </w:t>
+      </w:r>
+      <w:proofErr w:type="spellStart"/>
+      <w:r>
+        <w:t>variando</w:t>
+      </w:r>
+      <w:proofErr w:type="spellEnd"/>
+      <w:r>
+        <w:t xml:space="preserve"> </w:t>
+      </w:r>
+      <w:proofErr w:type="spellStart"/>
+      <w:r>
+        <w:t>únicamente</w:t>
+      </w:r>
+      <w:proofErr w:type="spellEnd"/>
+      <w:r>
+        <w:t xml:space="preserve"> el </w:t>
+      </w:r>
+      <w:proofErr w:type="spellStart"/>
+      <w:r>
+        <w:t>parámetro</w:t>
+      </w:r>
+      <w:proofErr w:type="spellEnd"/>
+      <w:r>
+        <w:t xml:space="preserve"> de </w:t>
+      </w:r>
+      <w:proofErr w:type="spellStart"/>
+      <w:r>
+        <w:t>profundidad</w:t>
+      </w:r>
+      <w:proofErr w:type="spellEnd"/>
+      <w:r>
+        <w:t xml:space="preserve">. El </w:t>
+      </w:r>
+      <w:proofErr w:type="spellStart"/>
+      <w:r>
+        <w:t>proyecto</w:t>
+      </w:r>
+      <w:proofErr w:type="spellEnd"/>
+      <w:r>
+        <w:t xml:space="preserve"> </w:t>
+      </w:r>
+      <w:proofErr w:type="spellStart"/>
+      <w:r>
+        <w:t>declara</w:t>
+      </w:r>
+      <w:proofErr w:type="spellEnd"/>
+      <w:r>
+        <w:t xml:space="preserve"> sus </w:t>
+      </w:r>
+      <w:proofErr w:type="spellStart"/>
+      <w:r>
+        <w:t>dependencias</w:t>
+      </w:r>
+      <w:proofErr w:type="spellEnd"/>
+      <w:r>
+        <w:t xml:space="preserve"> </w:t>
+      </w:r>
+      <w:proofErr w:type="spellStart"/>
+      <w:r>
+        <w:t>principales</w:t>
+      </w:r>
+      <w:proofErr w:type="spellEnd"/>
+      <w:r>
+        <w:t xml:space="preserve"> (pandas, NumPy, scikit-learn, Matplotlib, Seaborn) </w:t>
+      </w:r>
+      <w:proofErr w:type="spellStart"/>
+      <w:r>
+        <w:t>en</w:t>
+      </w:r>
+      <w:proofErr w:type="spellEnd"/>
+      <w:r>
+        <w:t xml:space="preserve"> requirements.txt, lo </w:t>
+      </w:r>
+      <w:proofErr w:type="spellStart"/>
+      <w:r>
+        <w:t>que</w:t>
+      </w:r>
+      <w:proofErr w:type="spellEnd"/>
+      <w:r>
+        <w:t xml:space="preserve"> </w:t>
+      </w:r>
+      <w:proofErr w:type="spellStart"/>
+      <w:r>
+        <w:t>fortalece</w:t>
+      </w:r>
+      <w:proofErr w:type="spellEnd"/>
+      <w:r>
+        <w:t xml:space="preserve"> la </w:t>
+      </w:r>
+      <w:proofErr w:type="spellStart"/>
+      <w:r>
+        <w:t>reproducibilidad</w:t>
+      </w:r>
+      <w:proofErr w:type="spellEnd"/>
+      <w:r>
+        <w:t xml:space="preserve"> y </w:t>
+      </w:r>
+      <w:proofErr w:type="spellStart"/>
+      <w:r>
+        <w:t>permite</w:t>
+      </w:r>
+      <w:proofErr w:type="spellEnd"/>
+      <w:r>
+        <w:t xml:space="preserve"> </w:t>
+      </w:r>
+      <w:proofErr w:type="spellStart"/>
+      <w:r>
+        <w:t>que</w:t>
+      </w:r>
+      <w:proofErr w:type="spellEnd"/>
+      <w:r>
+        <w:t xml:space="preserve"> </w:t>
+      </w:r>
+      <w:proofErr w:type="spellStart"/>
+      <w:r>
+        <w:t>cualquier</w:t>
+      </w:r>
+      <w:proofErr w:type="spellEnd"/>
+      <w:r>
+        <w:t xml:space="preserve"> </w:t>
+      </w:r>
+      <w:proofErr w:type="spellStart"/>
+      <w:r>
+        <w:t>integrante</w:t>
+      </w:r>
+      <w:proofErr w:type="spellEnd"/>
+      <w:r>
+        <w:t xml:space="preserve"> del </w:t>
+      </w:r>
+      <w:proofErr w:type="spellStart"/>
+      <w:r>
+        <w:t>equipo</w:t>
+      </w:r>
+      <w:proofErr w:type="spellEnd"/>
+      <w:r>
+        <w:t xml:space="preserve"> </w:t>
+      </w:r>
+      <w:proofErr w:type="spellStart"/>
+      <w:r>
+        <w:t>ejecute</w:t>
+      </w:r>
+      <w:proofErr w:type="spellEnd"/>
+      <w:r>
+        <w:t xml:space="preserve"> el </w:t>
+      </w:r>
+      <w:proofErr w:type="spellStart"/>
+      <w:r>
+        <w:t>mismo</w:t>
+      </w:r>
+      <w:proofErr w:type="spellEnd"/>
+      <w:r>
+        <w:t xml:space="preserve"> </w:t>
+      </w:r>
+      <w:proofErr w:type="spellStart"/>
+      <w:r>
+        <w:t>flujo</w:t>
+      </w:r>
+      <w:proofErr w:type="spellEnd"/>
+      <w:r>
+        <w:t xml:space="preserve"> </w:t>
+      </w:r>
+      <w:proofErr w:type="spellStart"/>
+      <w:r>
+        <w:t>analítico</w:t>
+      </w:r>
+      <w:proofErr w:type="spellEnd"/>
+      <w:r>
+        <w:t xml:space="preserve"> y </w:t>
+      </w:r>
+      <w:proofErr w:type="spellStart"/>
+      <w:r>
+        <w:t>obtenga</w:t>
+      </w:r>
+      <w:proofErr w:type="spellEnd"/>
+      <w:r>
+        <w:t xml:space="preserve"> </w:t>
+      </w:r>
+      <w:proofErr w:type="spellStart"/>
+      <w:r>
+        <w:t>resultados</w:t>
+      </w:r>
+      <w:proofErr w:type="spellEnd"/>
+      <w:r>
+        <w:t xml:space="preserve"> </w:t>
+      </w:r>
+      <w:proofErr w:type="spellStart"/>
+      <w:r>
+        <w:t>idénticos</w:t>
+      </w:r>
+      <w:proofErr w:type="spellEnd"/>
+      <w:r>
+        <w:t xml:space="preserve">, dado el </w:t>
+      </w:r>
+      <w:proofErr w:type="spellStart"/>
+      <w:r>
+        <w:t>uso</w:t>
+      </w:r>
+      <w:proofErr w:type="spellEnd"/>
+      <w:r>
+        <w:t xml:space="preserve"> </w:t>
+      </w:r>
+      <w:proofErr w:type="spellStart"/>
+      <w:r>
+        <w:t>consistente</w:t>
+      </w:r>
+      <w:proofErr w:type="spellEnd"/>
+      <w:r>
+        <w:t xml:space="preserve"> de </w:t>
+      </w:r>
+      <w:proofErr w:type="spellStart"/>
+      <w:r>
+        <w:t>random_state</w:t>
+      </w:r>
+      <w:proofErr w:type="spellEnd"/>
+      <w:r>
+        <w:t xml:space="preserve">=42 </w:t>
+      </w:r>
+      <w:proofErr w:type="spellStart"/>
+      <w:r>
+        <w:t>en</w:t>
+      </w:r>
+      <w:proofErr w:type="spellEnd"/>
+      <w:r>
+        <w:t xml:space="preserve"> las </w:t>
+      </w:r>
+      <w:proofErr w:type="spellStart"/>
+      <w:r>
+        <w:t>tres</w:t>
+      </w:r>
+      <w:proofErr w:type="spellEnd"/>
+      <w:r>
+        <w:t xml:space="preserve"> </w:t>
+      </w:r>
+      <w:proofErr w:type="spellStart"/>
+      <w:r>
+        <w:t>arquitecturas</w:t>
+      </w:r>
+      <w:proofErr w:type="spellEnd"/>
+      <w:r>
+        <w:t xml:space="preserve"> de red neuronal.</w:t>
       </w:r>
     </w:p>
     <w:p>
@@ -3460,12 +3946,63 @@
         <w:jc w:val="both"/>
       </w:pPr>
       <w:r>
-        <w:t>Se implementa un Perceptrón Multicapa (MLPClassifier) con una única capa oculta: una capa de entrada de 34 neuronas (una por variable predictora), una capa oculta de 32 neuronas con activación ReLU, y una capa de salida de 3 neuronas con activación softmax (gestionada internamente por MLPClassifier para clasificación multiclase), que entrega la probabilidad de cada clase de Risk_Category.</w:t>
+        <w:t xml:space="preserve">Se implementa un Perceptrón Multicapa (MLPClassifier) con una única capa oculta: una capa de entrada de 34 neuronas (una por variable predictora), una capa oculta de 32 neuronas con activación ReLU, y una capa de salida de 3 neuronas con activación softmax (gestionada internamente por MLPClassifier para clasificación multiclase), </w:t>
+      </w:r>
+      <w:proofErr w:type="spellStart"/>
+      <w:r>
+        <w:t>que</w:t>
+      </w:r>
+      <w:proofErr w:type="spellEnd"/>
+      <w:r>
+        <w:t xml:space="preserve"> </w:t>
+      </w:r>
+      <w:proofErr w:type="spellStart"/>
+      <w:r>
+        <w:t>entrega</w:t>
+      </w:r>
+      <w:proofErr w:type="spellEnd"/>
+      <w:r>
+        <w:t xml:space="preserve"> la </w:t>
+      </w:r>
+      <w:proofErr w:type="spellStart"/>
+      <w:r>
+        <w:t>probabilidad</w:t>
+      </w:r>
+      <w:proofErr w:type="spellEnd"/>
+      <w:r>
+        <w:t xml:space="preserve"> de </w:t>
+      </w:r>
+      <w:proofErr w:type="spellStart"/>
+      <w:r>
+        <w:t>cada</w:t>
+      </w:r>
+      <w:proofErr w:type="spellEnd"/>
+      <w:r>
+        <w:t xml:space="preserve"> </w:t>
+      </w:r>
+      <w:proofErr w:type="spellStart"/>
+      <w:r>
+        <w:t>clase</w:t>
+      </w:r>
+      <w:proofErr w:type="spellEnd"/>
+      <w:r>
+        <w:t xml:space="preserve"> de </w:t>
+      </w:r>
+      <w:proofErr w:type="spellStart"/>
+      <w:r>
+        <w:t>Risk_Category</w:t>
+      </w:r>
+      <w:proofErr w:type="spellEnd"/>
+      <w:r>
+        <w:t xml:space="preserve"> (scikit-learn Developers, 2026b)</w:t>
+      </w:r>
+      <w:r>
+        <w:t>.</w:t>
       </w:r>
     </w:p>
     <w:tbl>
       <w:tblPr>
-        <w:tblStyle w:val="TableGrid"/>
+        <w:tblStyle w:val="Tablaconcuadrcula"/>
         <w:tblW w:w="0" w:type="auto"/>
         <w:jc w:val="center"/>
         <w:tblLook w:val="04A0" w:firstRow="1" w:lastRow="0" w:firstColumn="1" w:lastColumn="0" w:noHBand="0" w:noVBand="1"/>
@@ -3862,7 +4399,7 @@
     </w:p>
     <w:tbl>
       <w:tblPr>
-        <w:tblStyle w:val="TableGrid"/>
+        <w:tblStyle w:val="Tablaconcuadrcula"/>
         <w:tblW w:w="0" w:type="auto"/>
         <w:jc w:val="center"/>
         <w:tblLook w:val="04A0" w:firstRow="1" w:lastRow="0" w:firstColumn="1" w:lastColumn="0" w:noHBand="0" w:noVBand="1"/>
@@ -4149,11 +4686,163 @@
         <w:jc w:val="both"/>
       </w:pPr>
       <w:r>
-        <w:t xml:space="preserve">El modelo con una capa oculta alcanza un desempeño muy alto sobre el conjunto de prueba (accuracy y F1-score macro por sobre 0,99). La matriz de confusión muestra que las clases Low y High se predicen sin errores; la única confusión (4 casos) se concentra en la frontera entre Medium y High. La curva de pérdida decrece de forma rápida y estable, sin señales de inestabilidad en el entrenamiento, y el criterio early_stopping detiene el ajuste en la iteración 40, muy por debajo de las </w:t>
-      </w:r>
+        <w:t xml:space="preserve">El modelo con una capa oculta alcanza un desempeño muy alto sobre el conjunto de prueba (accuracy y F1-score macro por sobre 0,99). La matriz de confusión muestra que las clases Low y High se predicen sin errores; la única confusión (4 casos) se concentra en la frontera entre Medium y High. La curva de pérdida decrece de forma rápida y estable, sin señales de inestabilidad en el entrenamiento, </w:t>
+      </w:r>
+      <w:r>
+        <w:t xml:space="preserve">y el </w:t>
+      </w:r>
+      <w:proofErr w:type="spellStart"/>
+      <w:r>
+        <w:t>criterio</w:t>
+      </w:r>
+      <w:proofErr w:type="spellEnd"/>
+      <w:r>
+        <w:t xml:space="preserve"> </w:t>
+      </w:r>
+      <w:proofErr w:type="spellStart"/>
+      <w:r>
+        <w:t>early_stopping</w:t>
+      </w:r>
+      <w:proofErr w:type="spellEnd"/>
+      <w:r>
+        <w:t xml:space="preserve">, </w:t>
+      </w:r>
+      <w:proofErr w:type="spellStart"/>
+      <w:r>
+        <w:t>que</w:t>
+      </w:r>
+      <w:proofErr w:type="spellEnd"/>
+      <w:r>
+        <w:t xml:space="preserve"> </w:t>
+      </w:r>
+      <w:proofErr w:type="spellStart"/>
+      <w:r>
+        <w:t>reserva</w:t>
+      </w:r>
+      <w:proofErr w:type="spellEnd"/>
+      <w:r>
+        <w:t xml:space="preserve"> </w:t>
+      </w:r>
+      <w:proofErr w:type="spellStart"/>
+      <w:r>
+        <w:t>internamente</w:t>
+      </w:r>
+      <w:proofErr w:type="spellEnd"/>
+      <w:r>
+        <w:t xml:space="preserve"> </w:t>
+      </w:r>
+      <w:proofErr w:type="spellStart"/>
+      <w:r>
+        <w:t>una</w:t>
+      </w:r>
+      <w:proofErr w:type="spellEnd"/>
+      <w:r>
+        <w:t xml:space="preserve"> </w:t>
+      </w:r>
+      <w:proofErr w:type="spellStart"/>
+      <w:r>
+        <w:t>fracción</w:t>
+      </w:r>
+      <w:proofErr w:type="spellEnd"/>
+      <w:r>
+        <w:t xml:space="preserve"> del conjunto de </w:t>
+      </w:r>
+      <w:proofErr w:type="spellStart"/>
       <w:r>
         <w:lastRenderedPageBreak/>
-        <w:t>1000 épocas máximas. Este resultado es consistente con el hallazgo de la sección IV: al incorporar Job_Title, el problema de clasificación se vuelve casi linealmente separable, por lo que una arquitectura simple —una sola capa oculta— ya es suficiente para capturar la relación entre los predictores y Risk_Category.</w:t>
+        <w:t>entrenamiento</w:t>
+      </w:r>
+      <w:proofErr w:type="spellEnd"/>
+      <w:r>
+        <w:t xml:space="preserve"> </w:t>
+      </w:r>
+      <w:proofErr w:type="spellStart"/>
+      <w:r>
+        <w:t>como</w:t>
+      </w:r>
+      <w:proofErr w:type="spellEnd"/>
+      <w:r>
+        <w:t xml:space="preserve"> </w:t>
+      </w:r>
+      <w:proofErr w:type="spellStart"/>
+      <w:r>
+        <w:t>validación</w:t>
+      </w:r>
+      <w:proofErr w:type="spellEnd"/>
+      <w:r>
+        <w:t xml:space="preserve"> (scikit-learn Developers, 2026b), </w:t>
+      </w:r>
+      <w:proofErr w:type="spellStart"/>
+      <w:r>
+        <w:t>detiene</w:t>
+      </w:r>
+      <w:proofErr w:type="spellEnd"/>
+      <w:r>
+        <w:t xml:space="preserve"> el </w:t>
+      </w:r>
+      <w:proofErr w:type="spellStart"/>
+      <w:r>
+        <w:t>ajuste</w:t>
+      </w:r>
+      <w:proofErr w:type="spellEnd"/>
+      <w:r>
+        <w:t xml:space="preserve"> </w:t>
+      </w:r>
+      <w:proofErr w:type="spellStart"/>
+      <w:r>
+        <w:t>en</w:t>
+      </w:r>
+      <w:proofErr w:type="spellEnd"/>
+      <w:r>
+        <w:t xml:space="preserve"> la </w:t>
+      </w:r>
+      <w:proofErr w:type="spellStart"/>
+      <w:r>
+        <w:t>iteración</w:t>
+      </w:r>
+      <w:proofErr w:type="spellEnd"/>
+      <w:r>
+        <w:t xml:space="preserve"> 40, </w:t>
+      </w:r>
+      <w:proofErr w:type="spellStart"/>
+      <w:r>
+        <w:t>muy</w:t>
+      </w:r>
+      <w:proofErr w:type="spellEnd"/>
+      <w:r>
+        <w:t xml:space="preserve"> </w:t>
+      </w:r>
+      <w:proofErr w:type="spellStart"/>
+      <w:r>
+        <w:t>por</w:t>
+      </w:r>
+      <w:proofErr w:type="spellEnd"/>
+      <w:r>
+        <w:t xml:space="preserve"> </w:t>
+      </w:r>
+      <w:proofErr w:type="spellStart"/>
+      <w:r>
+        <w:t>debajo</w:t>
+      </w:r>
+      <w:proofErr w:type="spellEnd"/>
+      <w:r>
+        <w:t xml:space="preserve"> de las 1000 </w:t>
+      </w:r>
+      <w:proofErr w:type="spellStart"/>
+      <w:r>
+        <w:t>épocas</w:t>
+      </w:r>
+      <w:proofErr w:type="spellEnd"/>
+      <w:r>
+        <w:t xml:space="preserve"> </w:t>
+      </w:r>
+      <w:proofErr w:type="spellStart"/>
+      <w:r>
+        <w:t>máximas</w:t>
+      </w:r>
+      <w:proofErr w:type="spellEnd"/>
+      <w:r>
+        <w:t>. Este resultado es consistente con el hallazgo de la sección IV: al incorporar Job_Title, el problema de clasificación se vuelve casi linealmente separable, por lo que una arquitectura simple —una sola capa oculta— ya es suficiente para capturar la relación entre los predictores y Risk_Category.</w:t>
       </w:r>
     </w:p>
     <w:p>
@@ -4186,7 +4875,7 @@
     </w:p>
     <w:tbl>
       <w:tblPr>
-        <w:tblStyle w:val="TableGrid"/>
+        <w:tblStyle w:val="Tablaconcuadrcula"/>
         <w:tblW w:w="0" w:type="auto"/>
         <w:jc w:val="center"/>
         <w:tblLook w:val="04A0" w:firstRow="1" w:lastRow="0" w:firstColumn="1" w:lastColumn="0" w:noHBand="0" w:noVBand="1"/>
@@ -4583,7 +5272,7 @@
     </w:p>
     <w:tbl>
       <w:tblPr>
-        <w:tblStyle w:val="TableGrid"/>
+        <w:tblStyle w:val="Tablaconcuadrcula"/>
         <w:tblW w:w="0" w:type="auto"/>
         <w:jc w:val="center"/>
         <w:tblLook w:val="04A0" w:firstRow="1" w:lastRow="0" w:firstColumn="1" w:lastColumn="0" w:noHBand="0" w:noVBand="1"/>
@@ -4870,11 +5559,146 @@
         <w:jc w:val="both"/>
       </w:pPr>
       <w:r>
-        <w:t>El modelo con dos capas ocultas también alcanza un desempeño muy alto, aunque levemente inferior al de una sola capa oculta (accuracy 0,9867 y F1-score macro 0,9855, con 8 errores frente a los 4 del modelo anterior, distribuidos entre las fronteras Low/Medium y Medium/High). El entrenamiento converge en menos iteraciones (27) que el modelo anterior (40), lo que sugiere que la red encuentra más rápido un óptimo local, pero no necesariamente uno mejor. Este comportamiento es consistente con la hipótesis planteada en la sección IV: dado que la relación entre los predictores (especialmente Job_Title) y Risk_Category es casi linealmente separable, añadir una segunda capa oculta introduce capacidad adicional que el problema no requiere, sin traducirse en una mejora de desempeño sobre el conjunto de prueba.</w:t>
+        <w:t xml:space="preserve">El modelo con dos capas ocultas también alcanza un desempeño muy alto, aunque levemente inferior al de una sola capa oculta (accuracy 0,9867 y F1-score </w:t>
+      </w:r>
+      <w:proofErr w:type="gramStart"/>
+      <w:r>
+        <w:t>macro 0,9855</w:t>
+      </w:r>
+      <w:proofErr w:type="gramEnd"/>
+      <w:r>
+        <w:t xml:space="preserve">, </w:t>
+      </w:r>
+      <w:r>
+        <w:t xml:space="preserve">con 8 </w:t>
+      </w:r>
+      <w:proofErr w:type="spellStart"/>
+      <w:r>
+        <w:t>errores</w:t>
+      </w:r>
+      <w:proofErr w:type="spellEnd"/>
+      <w:r>
+        <w:t xml:space="preserve"> </w:t>
+      </w:r>
+      <w:proofErr w:type="spellStart"/>
+      <w:r>
+        <w:t>frente</w:t>
+      </w:r>
+      <w:proofErr w:type="spellEnd"/>
+      <w:r>
+        <w:t xml:space="preserve"> a </w:t>
+      </w:r>
+      <w:proofErr w:type="spellStart"/>
+      <w:r>
+        <w:t>los</w:t>
+      </w:r>
+      <w:proofErr w:type="spellEnd"/>
+      <w:r>
+        <w:t xml:space="preserve"> 4 del </w:t>
+      </w:r>
+      <w:proofErr w:type="spellStart"/>
+      <w:r>
+        <w:t>modelo</w:t>
+      </w:r>
+      <w:proofErr w:type="spellEnd"/>
+      <w:r>
+        <w:t xml:space="preserve"> anterior: cuatro </w:t>
+      </w:r>
+      <w:proofErr w:type="spellStart"/>
+      <w:r>
+        <w:t>observaciones</w:t>
+      </w:r>
+      <w:proofErr w:type="spellEnd"/>
+      <w:r>
+        <w:t xml:space="preserve"> reales de </w:t>
+      </w:r>
+      <w:proofErr w:type="spellStart"/>
+      <w:r>
+        <w:t>clase</w:t>
+      </w:r>
+      <w:proofErr w:type="spellEnd"/>
+      <w:r>
+        <w:t xml:space="preserve"> Medium </w:t>
+      </w:r>
+      <w:proofErr w:type="spellStart"/>
+      <w:r>
+        <w:t>clasificadas</w:t>
+      </w:r>
+      <w:proofErr w:type="spellEnd"/>
+      <w:r>
+        <w:t xml:space="preserve"> </w:t>
+      </w:r>
+      <w:proofErr w:type="spellStart"/>
+      <w:r>
+        <w:t>como</w:t>
+      </w:r>
+      <w:proofErr w:type="spellEnd"/>
+      <w:r>
+        <w:t xml:space="preserve"> High, dos </w:t>
+      </w:r>
+      <w:proofErr w:type="spellStart"/>
+      <w:r>
+        <w:t>observaciones</w:t>
+      </w:r>
+      <w:proofErr w:type="spellEnd"/>
+      <w:r>
+        <w:t xml:space="preserve"> Low </w:t>
+      </w:r>
+      <w:proofErr w:type="spellStart"/>
+      <w:r>
+        <w:t>clasificadas</w:t>
+      </w:r>
+      <w:proofErr w:type="spellEnd"/>
+      <w:r>
+        <w:t xml:space="preserve"> </w:t>
+      </w:r>
+      <w:proofErr w:type="spellStart"/>
+      <w:r>
+        <w:t>como</w:t>
+      </w:r>
+      <w:proofErr w:type="spellEnd"/>
+      <w:r>
+        <w:t xml:space="preserve"> </w:t>
+      </w:r>
+      <w:proofErr w:type="gramStart"/>
+      <w:r>
+        <w:t>Medium</w:t>
+      </w:r>
+      <w:proofErr w:type="gramEnd"/>
+      <w:r>
+        <w:t xml:space="preserve"> y dos </w:t>
+      </w:r>
+      <w:proofErr w:type="spellStart"/>
+      <w:r>
+        <w:t>observaciones</w:t>
+      </w:r>
+      <w:proofErr w:type="spellEnd"/>
+      <w:r>
+        <w:t xml:space="preserve"> Low </w:t>
+      </w:r>
+      <w:proofErr w:type="spellStart"/>
+      <w:r>
+        <w:t>clasificadas</w:t>
+      </w:r>
+      <w:proofErr w:type="spellEnd"/>
+      <w:r>
+        <w:t xml:space="preserve"> </w:t>
+      </w:r>
+      <w:proofErr w:type="spellStart"/>
+      <w:r>
+        <w:t>como</w:t>
+      </w:r>
+      <w:proofErr w:type="spellEnd"/>
+      <w:r>
+        <w:t xml:space="preserve"> High</w:t>
+      </w:r>
+      <w:r>
+        <w:t>. El entrenamiento converge en menos iteraciones (27) que el modelo anterior (40), lo que sugiere que la red encuentra más rápido un óptimo local, pero no necesariamente uno mejor. Este comportamiento es consistente con la hipótesis planteada en la sección IV: dado que la relación entre los predictores (especialmente Job_Title) y Risk_Category es casi linealmente separable, añadir una segunda capa oculta introduce capacidad adicional que el problema no requiere, sin traducirse en una mejora de desempeño sobre el conjunto de prueba.</w:t>
       </w:r>
     </w:p>
     <w:p>
       <w:r>
+        <w:lastRenderedPageBreak/>
         <w:br w:type="page"/>
       </w:r>
     </w:p>
@@ -4903,7 +5727,7 @@
     </w:p>
     <w:tbl>
       <w:tblPr>
-        <w:tblStyle w:val="TableGrid"/>
+        <w:tblStyle w:val="Tablaconcuadrcula"/>
         <w:tblW w:w="0" w:type="auto"/>
         <w:jc w:val="center"/>
         <w:tblLook w:val="04A0" w:firstRow="1" w:lastRow="0" w:firstColumn="1" w:lastColumn="0" w:noHBand="0" w:noVBand="1"/>
@@ -5300,7 +6124,7 @@
     </w:p>
     <w:tbl>
       <w:tblPr>
-        <w:tblStyle w:val="TableGrid"/>
+        <w:tblStyle w:val="Tablaconcuadrcula"/>
         <w:tblW w:w="0" w:type="auto"/>
         <w:jc w:val="center"/>
         <w:tblLook w:val="04A0" w:firstRow="1" w:lastRow="0" w:firstColumn="1" w:lastColumn="0" w:noHBand="0" w:noVBand="1"/>
@@ -5620,7 +6444,7 @@
     </w:p>
     <w:tbl>
       <w:tblPr>
-        <w:tblStyle w:val="TableGrid"/>
+        <w:tblStyle w:val="Tablaconcuadrcula"/>
         <w:tblW w:w="0" w:type="auto"/>
         <w:jc w:val="center"/>
         <w:tblLook w:val="04A0" w:firstRow="1" w:lastRow="0" w:firstColumn="1" w:lastColumn="0" w:noHBand="0" w:noVBand="1"/>
@@ -6018,7 +6842,7 @@
     </w:p>
     <w:tbl>
       <w:tblPr>
-        <w:tblStyle w:val="TableGrid"/>
+        <w:tblStyle w:val="Tablaconcuadrcula"/>
         <w:tblW w:w="0" w:type="auto"/>
         <w:jc w:val="center"/>
         <w:tblLook w:val="04A0" w:firstRow="1" w:lastRow="0" w:firstColumn="1" w:lastColumn="0" w:noHBand="0" w:noVBand="1"/>
@@ -6361,10 +7185,20 @@
         <w:jc w:val="both"/>
       </w:pPr>
       <w:r>
-        <w:t>Las tres arquitecturas alcanzan un desempeño muy alto y muy similar entre sí (accuracy y F1-score macro por sobre 0,98 en los tres casos), muy por encima de un clasificador trivial que siempre prediga la clase mayoritaria Medium (que obtendría un accuracy ≈ 0,507, equivalente a su proporción en el dataset, sección 4.1). Esto confirma, con evidencia directa sobre el conjunto de prueba, que la inclusión de Job_Title (sección 3.2) provee una señal casi determinística para separar las tres clases de Risk_Category, tal como se anticipó en el análisis exploratorio (sección IV). Las matrices de confusión de las secciones VI a VIII muestran además que, en los tres modelos, la escasa confusión residual se concentra entre las clases Medium y High, nunca entre Low y High (las dos categorías más alejadas en el espectro de riesgo), lo que es coherente con el problema de clasificación planteado en la Fase 1: el modelo distingue con solidez los extremos del riesgo de automatización y presenta su margen de error, comprensible, en la frontera entre niveles adyacentes.</w:t>
-      </w:r>
-    </w:p>
-    <w:p>
+        <w:t xml:space="preserve">Las tres arquitecturas alcanzan un desempeño muy alto y muy similar entre sí (accuracy y F1-score macro por sobre 0,98 en los tres casos), muy por encima de un clasificador trivial que siempre prediga la clase mayoritaria Medium (que obtendría un accuracy ≈ 0,507, equivalente a su proporción en el dataset, sección 4.1). Esto confirma, con evidencia directa sobre el conjunto de prueba, que la inclusión de Job_Title (sección 3.2) provee una señal casi determinística para separar las tres clases de Risk_Category, tal como se anticipó en el análisis </w:t>
+      </w:r>
+      <w:r>
+        <w:rPr>
+          <w:lang w:val="es-CL"/>
+        </w:rPr>
+        <w:t xml:space="preserve">exploratorio (sección IV). </w:t>
+      </w:r>
+      <w:r>
+        <w:rPr>
+          <w:lang w:val="es-CL"/>
+        </w:rPr>
+        <w:t>Las matrices de confusión de las secciones VI a VIII muestran además que la confusión residual se concentra en las fronteras entre categorías contiguas, principalmente Medium/High. Los errores entre Low y High —las dos categorías más alejadas del espectro de riesgo— son prácticamente inexistentes: las arquitecturas de una y tres capas ocultas no registran ninguno, y la de dos capas ocultas presenta solo dos casos sobre 600 observaciones. Este comportamiento es coherente con el problema de clasificación planteado en la Fase 1: el modelo distingue con solidez los extremos del riesgo de automatización y concentra su margen de error en la frontera entre niveles adyacentes.</w:t>
+      </w:r>
       <w:r>
         <w:br w:type="page"/>
       </w:r>
@@ -6457,12 +7291,67 @@
         <w:jc w:val="both"/>
       </w:pPr>
       <w:r>
-        <w:t>La diferencia de desempeño entre arquitecturas no sigue un patrón de 'a mayor profundidad, mejor desempeño': el modelo de una capa oculta supera tanto al de dos como al de tres capas. Esto es coherente con la naturaleza del problema identificada en el análisis exploratorio (sección IV): al incorporar Job_Title como predictor dummy, la relación entre las variables de entrada y Risk_Category se vuelve casi linealmente separable (cada categoría de cargo se asocia de forma casi exclusiva a una única clase de riesgo). En un escenario así, una red con una sola capa oculta ya cuenta con suficiente capacidad de representación; agregar capas adicionales introduce más parámetros a optimizar sin que exista una relación no lineal adicional relevante que estas puedan capturar.</w:t>
+        <w:t xml:space="preserve">La diferencia de desempeño entre arquitecturas no sigue un patrón de 'a mayor profundidad, mejor desempeño': el modelo de una capa oculta supera tanto al de dos como al de tres capas. Esto es coherente con la naturaleza del problema identificada en el análisis exploratorio (sección IV): al incorporar Job_Title como predictor dummy, la relación entre las variables de entrada y Risk_Category se vuelve casi linealmente separable (cada categoría de cargo se asocia de forma casi exclusiva a una única clase de riesgo). En un escenario así, una red con una sola capa oculta ya cuenta con suficiente capacidad de representación; agregar capas adicionales introduce más parámetros </w:t>
+      </w:r>
+      <w:proofErr w:type="gramStart"/>
+      <w:r>
+        <w:t>a</w:t>
+      </w:r>
+      <w:proofErr w:type="gramEnd"/>
+      <w:r>
+        <w:t xml:space="preserve"> optimizar sin que exista una relación no lineal adicional relevante </w:t>
+      </w:r>
+      <w:proofErr w:type="spellStart"/>
+      <w:r>
+        <w:t>que</w:t>
+      </w:r>
+      <w:proofErr w:type="spellEnd"/>
+      <w:r>
+        <w:t xml:space="preserve"> </w:t>
+      </w:r>
+      <w:proofErr w:type="spellStart"/>
+      <w:r>
+        <w:t>estas</w:t>
+      </w:r>
+      <w:proofErr w:type="spellEnd"/>
+      <w:r>
+        <w:t xml:space="preserve"> </w:t>
+      </w:r>
+      <w:proofErr w:type="spellStart"/>
+      <w:r>
+        <w:t>puedan</w:t>
+      </w:r>
+      <w:proofErr w:type="spellEnd"/>
+      <w:r>
+        <w:t xml:space="preserve"> </w:t>
+      </w:r>
+      <w:proofErr w:type="spellStart"/>
+      <w:r>
+        <w:t>capturar</w:t>
+      </w:r>
+      <w:proofErr w:type="spellEnd"/>
+      <w:r>
+        <w:t>.</w:t>
+      </w:r>
+    </w:p>
+    <w:p>
+      <w:pPr>
+        <w:spacing w:after="160"/>
+        <w:jc w:val="both"/>
+        <w:rPr>
+          <w:lang w:val="es-CL"/>
+        </w:rPr>
+      </w:pPr>
+      <w:r>
+        <w:rPr>
+          <w:lang w:val="es-CL"/>
+        </w:rPr>
+        <w:t>Este comportamiento es consistente con el principio de que la profundidad aporta capacidad de representación jerárquica solo cuando la estructura del problema la requiere: en ausencia de esa estructura, el aumento del número de parámetros incrementa la dificultad de optimización sin traducirse en una mejor generalización (Goodfellow et al., 2016).</w:t>
       </w:r>
     </w:p>
     <w:tbl>
       <w:tblPr>
-        <w:tblStyle w:val="TableGrid"/>
+        <w:tblStyle w:val="Tablaconcuadrcula"/>
         <w:tblW w:w="0" w:type="auto"/>
         <w:jc w:val="center"/>
         <w:tblLook w:val="04A0" w:firstRow="1" w:lastRow="0" w:firstColumn="1" w:lastColumn="0" w:noHBand="0" w:noVBand="1"/>
@@ -6694,7 +7583,14 @@
               <w:rPr>
                 <w:sz w:val="19"/>
               </w:rPr>
-              <w:t>Recupera parte del desempeño perdido por el modelo de dos capas (accuracy 0,9917); mayor flexibilidad estructural.</w:t>
+              <w:t xml:space="preserve">Recupera parte del desempeño perdido por el </w:t>
+            </w:r>
+            <w:r>
+              <w:rPr>
+                <w:sz w:val="19"/>
+              </w:rPr>
+              <w:lastRenderedPageBreak/>
+              <w:t>modelo de dos capas (accuracy 0,9917); mayor flexibilidad estructural.</w:t>
             </w:r>
           </w:p>
         </w:tc>
@@ -6707,7 +7603,15 @@
               <w:rPr>
                 <w:sz w:val="19"/>
               </w:rPr>
-              <w:t>Arquitectura más compleja y de entrenamiento más costoso, sin superar al modelo más simple.</w:t>
+              <w:lastRenderedPageBreak/>
+              <w:t xml:space="preserve">Arquitectura más compleja y de </w:t>
+            </w:r>
+            <w:r>
+              <w:rPr>
+                <w:sz w:val="19"/>
+              </w:rPr>
+              <w:lastRenderedPageBreak/>
+              <w:t>entrenamiento más costoso, sin superar al modelo más simple.</w:t>
             </w:r>
           </w:p>
         </w:tc>
@@ -6720,7 +7624,15 @@
               <w:rPr>
                 <w:sz w:val="19"/>
               </w:rPr>
-              <w:t>Alternativa razonable si se requiere mayor capacidad representacional a futuro.</w:t>
+              <w:lastRenderedPageBreak/>
+              <w:t xml:space="preserve">Alternativa razonable si se requiere mayor capacidad </w:t>
+            </w:r>
+            <w:r>
+              <w:rPr>
+                <w:sz w:val="19"/>
+              </w:rPr>
+              <w:lastRenderedPageBreak/>
+              <w:t>representacional a futuro.</w:t>
             </w:r>
           </w:p>
         </w:tc>
@@ -6737,6 +7649,7 @@
           <w:color w:val="52514E"/>
           <w:sz w:val="20"/>
         </w:rPr>
+        <w:lastRenderedPageBreak/>
         <w:t>Tabla 17. Comparación cualitativa entre arquitecturas de redes neuronales.</w:t>
       </w:r>
     </w:p>
@@ -6746,7 +7659,6 @@
         <w:jc w:val="both"/>
       </w:pPr>
       <w:r>
-        <w:lastRenderedPageBreak/>
         <w:t>Para el problema de clasificación de Risk_Category sobre el dataset AI Impact on Jobs 2030, la evidencia recogida en esta fase sugiere que no es necesario recurrir a arquitecturas profundas: la red neuronal con una sola capa oculta iguala o supera a las arquitecturas más profundas, con menor costo computacional y menor riesgo de sobreajuste. Esta conclusión preliminar es coherente con el hallazgo de la Fase 2, donde el modelo más simple (regresión lineal) también igualó o superó a modelos más complejos (árbol de decisión, MLP de regresión) para el mismo dataset: en ambos casos, la señal dominante que aporta Job_Title explica por qué modelos simples resultan suficientes.</w:t>
       </w:r>
     </w:p>
@@ -6802,7 +7714,16 @@
         <w:jc w:val="both"/>
       </w:pPr>
       <w:r>
-        <w:t>Implicancias para la selección del modelo final: para NextWork Advisory, se recomienda la red neuronal con una capa oculta como modelo preferente para estimar Risk_Category, dado que ofrece el mejor desempeño observado junto con la menor complejidad computacional y el menor riesgo de sobreajuste entre las tres arquitecturas evaluadas. Las matrices de confusión de los tres modelos muestran además que los errores residuales se concentran consistentemente en la frontera Medium/High, nunca entre Low y High, lo que resulta relevante para priorizar la revisión manual de los casos límite en una eventual implementación operativa.</w:t>
+        <w:t xml:space="preserve">Implicancias para la selección del modelo final: para NextWork Advisory, se recomienda la red neuronal con una capa oculta como modelo preferente para estimar Risk_Category, dado que ofrece el mejor desempeño observado junto con la menor complejidad computacional y el menor riesgo de sobreajuste entre las tres arquitecturas evaluadas. </w:t>
+      </w:r>
+      <w:r>
+        <w:t xml:space="preserve">Las </w:t>
+      </w:r>
+      <w:r>
+        <w:rPr>
+          <w:lang w:val="es-CL"/>
+        </w:rPr>
+        <w:t>matrices de confusión muestran además que los errores residuales se concentran en las fronteras entre categorías contiguas, principalmente Medium/High, y que la confusión entre Low y High es prácticamente nula (ningún caso en las arquitecturas de una y tres capas ocultas, dos casos en la de dos capas). Esto resulta relevante para priorizar la revisión manual de los casos límite en una eventual implementación operativa.</w:t>
       </w:r>
     </w:p>
     <w:p>
@@ -6844,80 +7765,856 @@
     </w:p>
     <w:p>
       <w:pPr>
-        <w:spacing w:after="120"/>
+        <w:spacing w:after="160"/>
         <w:jc w:val="both"/>
+        <w:rPr>
+          <w:lang w:val="es-CL"/>
+        </w:rPr>
       </w:pPr>
       <w:r>
-        <w:t>Fayyad, U., Piatetsky-Shapiro, G., &amp; Smyth, P. (1996). From data mining to knowledge discovery in databases. AI Magazine, 17(3), 37-54. https://doi.org/10.1609/aimag.v17i3.1230</w:t>
-      </w:r>
-    </w:p>
-    <w:p>
-      <w:pPr>
-        <w:spacing w:after="120"/>
-        <w:jc w:val="both"/>
-      </w:pPr>
-      <w:r>
-        <w:t>Goodfellow, I., Bengio, Y., &amp; Courville, A. (2016). Deep learning. MIT Press. https://www.deeplearningbook.org/</w:t>
-      </w:r>
-    </w:p>
-    <w:p>
-      <w:pPr>
-        <w:spacing w:after="120"/>
-        <w:jc w:val="both"/>
-      </w:pPr>
-      <w:r>
-        <w:t>Pedregosa, F., Varoquaux, G., Gramfort, A., Michel, V., Thirion, B., Grisel, O., Blondel, M., Prettenhofer, P., Weiss, R., Dubourg, V., Vanderplas, J., Passos, A., Cournapeau, D., Brucher, M., Perrot, M., &amp; Duchesnay, É. (2011). Scikit-learn: Machine learning in Python. Journal of Machine Learning Research, 12, 2825-2830. https://jmlr.org/papers/v12/pedregosa11a.html</w:t>
-      </w:r>
-    </w:p>
-    <w:p>
-      <w:pPr>
-        <w:spacing w:after="120"/>
-        <w:jc w:val="both"/>
-      </w:pPr>
-      <w:r>
-        <w:t>Ruete, D. (2026a). Introducción al Machine Learning [Apunte]. Universidad Andrés Bello, Santiago, Chile.</w:t>
-      </w:r>
-    </w:p>
-    <w:p>
-      <w:pPr>
-        <w:spacing w:after="120"/>
-        <w:jc w:val="both"/>
-      </w:pPr>
-      <w:r>
-        <w:t>Ruete, D. (2026b). Fase 3: Redes neuronales para clasificación supervisada [Apunte]. Universidad Andrés Bello, Santiago, Chile.</w:t>
-      </w:r>
-    </w:p>
-    <w:p>
-      <w:pPr>
-        <w:spacing w:after="120"/>
-        <w:jc w:val="both"/>
-      </w:pPr>
-      <w:r>
-        <w:t>scikit-learn Developers. (2026a). sklearn.neural_network.MLPClassifier. scikit-learn. https://scikit-learn.org/stable/modules/generated/sklearn.neural_network.MLPClassifier.html</w:t>
-      </w:r>
-    </w:p>
-    <w:p>
-      <w:pPr>
-        <w:spacing w:after="120"/>
-        <w:jc w:val="both"/>
-      </w:pPr>
-      <w:r>
-        <w:t>scikit-learn Developers. (2026b). Metrics and scoring: quantifying the quality of predictions. scikit-learn. https://scikit-learn.org/stable/modules/model_evaluation.html</w:t>
-      </w:r>
+        <w:rPr>
+          <w:lang w:val="es-CL"/>
+        </w:rPr>
+        <w:t xml:space="preserve">Goodfellow, I., </w:t>
+      </w:r>
+      <w:proofErr w:type="spellStart"/>
+      <w:r>
+        <w:rPr>
+          <w:lang w:val="es-CL"/>
+        </w:rPr>
+        <w:t>Bengio</w:t>
+      </w:r>
+      <w:proofErr w:type="spellEnd"/>
+      <w:r>
+        <w:rPr>
+          <w:lang w:val="es-CL"/>
+        </w:rPr>
+        <w:t xml:space="preserve">, Y., &amp; Courville, A. (2016). </w:t>
+      </w:r>
+      <w:r>
+        <w:rPr>
+          <w:i/>
+          <w:iCs/>
+          <w:lang w:val="es-CL"/>
+        </w:rPr>
+        <w:t xml:space="preserve">Deep </w:t>
+      </w:r>
+      <w:proofErr w:type="spellStart"/>
+      <w:r>
+        <w:rPr>
+          <w:i/>
+          <w:iCs/>
+          <w:lang w:val="es-CL"/>
+        </w:rPr>
+        <w:t>learning</w:t>
+      </w:r>
+      <w:proofErr w:type="spellEnd"/>
+      <w:r>
+        <w:rPr>
+          <w:lang w:val="es-CL"/>
+        </w:rPr>
+        <w:t xml:space="preserve">. MIT Press. </w:t>
+      </w:r>
+      <w:hyperlink r:id="rId12" w:history="1">
+        <w:r>
+          <w:rPr>
+            <w:rStyle w:val="Hipervnculo"/>
+            <w:lang w:val="es-CL"/>
+          </w:rPr>
+          <w:t>https://www.deeplearningbook.org/</w:t>
+        </w:r>
+      </w:hyperlink>
     </w:p>
     <w:p>
       <w:pPr>
         <w:spacing w:after="160"/>
         <w:jc w:val="both"/>
+        <w:rPr>
+          <w:lang w:val="es-CL"/>
+        </w:rPr>
       </w:pPr>
+      <w:r>
+        <w:rPr>
+          <w:lang w:val="es-CL"/>
+        </w:rPr>
+        <w:t xml:space="preserve">Pedregosa, F., </w:t>
+      </w:r>
+      <w:proofErr w:type="spellStart"/>
+      <w:r>
+        <w:rPr>
+          <w:lang w:val="es-CL"/>
+        </w:rPr>
+        <w:t>Varoquaux</w:t>
+      </w:r>
+      <w:proofErr w:type="spellEnd"/>
+      <w:r>
+        <w:rPr>
+          <w:lang w:val="es-CL"/>
+        </w:rPr>
+        <w:t xml:space="preserve">, G., </w:t>
+      </w:r>
+      <w:proofErr w:type="spellStart"/>
+      <w:r>
+        <w:rPr>
+          <w:lang w:val="es-CL"/>
+        </w:rPr>
+        <w:t>Gramfort</w:t>
+      </w:r>
+      <w:proofErr w:type="spellEnd"/>
+      <w:r>
+        <w:rPr>
+          <w:lang w:val="es-CL"/>
+        </w:rPr>
+        <w:t xml:space="preserve">, A., Michel, V., Thirion, B., Grisel, O., Blondel, M., </w:t>
+      </w:r>
+      <w:proofErr w:type="spellStart"/>
+      <w:r>
+        <w:rPr>
+          <w:lang w:val="es-CL"/>
+        </w:rPr>
+        <w:t>Prettenhofer</w:t>
+      </w:r>
+      <w:proofErr w:type="spellEnd"/>
+      <w:r>
+        <w:rPr>
+          <w:lang w:val="es-CL"/>
+        </w:rPr>
+        <w:t xml:space="preserve">, P., Weiss, R., Dubourg, V., Vanderplas, J., Passos, A., </w:t>
+      </w:r>
+      <w:proofErr w:type="spellStart"/>
+      <w:r>
+        <w:rPr>
+          <w:lang w:val="es-CL"/>
+        </w:rPr>
+        <w:t>Cournapeau</w:t>
+      </w:r>
+      <w:proofErr w:type="spellEnd"/>
+      <w:r>
+        <w:rPr>
+          <w:lang w:val="es-CL"/>
+        </w:rPr>
+        <w:t xml:space="preserve">, D., Brucher, M., Perrot, M., &amp; </w:t>
+      </w:r>
+      <w:proofErr w:type="spellStart"/>
+      <w:r>
+        <w:rPr>
+          <w:lang w:val="es-CL"/>
+        </w:rPr>
+        <w:t>Duchesnay</w:t>
+      </w:r>
+      <w:proofErr w:type="spellEnd"/>
+      <w:r>
+        <w:rPr>
+          <w:lang w:val="es-CL"/>
+        </w:rPr>
+        <w:t xml:space="preserve">, É. (2011). </w:t>
+      </w:r>
+      <w:proofErr w:type="spellStart"/>
+      <w:r>
+        <w:rPr>
+          <w:lang w:val="es-CL"/>
+        </w:rPr>
+        <w:t>Scikit-learn</w:t>
+      </w:r>
+      <w:proofErr w:type="spellEnd"/>
+      <w:r>
+        <w:rPr>
+          <w:lang w:val="es-CL"/>
+        </w:rPr>
+        <w:t xml:space="preserve">: Machine </w:t>
+      </w:r>
+      <w:proofErr w:type="spellStart"/>
+      <w:r>
+        <w:rPr>
+          <w:lang w:val="es-CL"/>
+        </w:rPr>
+        <w:t>learning</w:t>
+      </w:r>
+      <w:proofErr w:type="spellEnd"/>
+      <w:r>
+        <w:rPr>
+          <w:lang w:val="es-CL"/>
+        </w:rPr>
+        <w:t xml:space="preserve"> in Python. </w:t>
+      </w:r>
+      <w:proofErr w:type="spellStart"/>
       <w:r>
         <w:rPr>
           <w:i/>
+          <w:iCs/>
+          <w:lang w:val="es-CL"/>
         </w:rPr>
-        <w:t>Distribución de fuentes según lo exigido por la rúbrica: 2 fuentes de material docente (Ruete, 2026a, 2026b), 3 fuentes de documentación técnica oficial (Pedregosa et al., 2011; scikit-learn Developers, 2026a, 2026b) y 2 fuentes académicas complementarias (Fayyad et al., 1996; Goodfellow et al., 2016), superando el mínimo de 5 fuentes distribuidas en las tres categorías solicitadas.</w:t>
-      </w:r>
+        <w:t>Journal</w:t>
+      </w:r>
+      <w:proofErr w:type="spellEnd"/>
+      <w:r>
+        <w:rPr>
+          <w:i/>
+          <w:iCs/>
+          <w:lang w:val="es-CL"/>
+        </w:rPr>
+        <w:t xml:space="preserve"> </w:t>
+      </w:r>
+      <w:proofErr w:type="spellStart"/>
+      <w:r>
+        <w:rPr>
+          <w:i/>
+          <w:iCs/>
+          <w:lang w:val="es-CL"/>
+        </w:rPr>
+        <w:t>of</w:t>
+      </w:r>
+      <w:proofErr w:type="spellEnd"/>
+      <w:r>
+        <w:rPr>
+          <w:i/>
+          <w:iCs/>
+          <w:lang w:val="es-CL"/>
+        </w:rPr>
+        <w:t xml:space="preserve"> Machine </w:t>
+      </w:r>
+      <w:proofErr w:type="spellStart"/>
+      <w:r>
+        <w:rPr>
+          <w:i/>
+          <w:iCs/>
+          <w:lang w:val="es-CL"/>
+        </w:rPr>
+        <w:t>Learning</w:t>
+      </w:r>
+      <w:proofErr w:type="spellEnd"/>
+      <w:r>
+        <w:rPr>
+          <w:i/>
+          <w:iCs/>
+          <w:lang w:val="es-CL"/>
+        </w:rPr>
+        <w:t xml:space="preserve"> </w:t>
+      </w:r>
+      <w:proofErr w:type="spellStart"/>
+      <w:r>
+        <w:rPr>
+          <w:i/>
+          <w:iCs/>
+          <w:lang w:val="es-CL"/>
+        </w:rPr>
+        <w:t>Research</w:t>
+      </w:r>
+      <w:proofErr w:type="spellEnd"/>
+      <w:r>
+        <w:rPr>
+          <w:lang w:val="es-CL"/>
+        </w:rPr>
+        <w:t xml:space="preserve">, </w:t>
+      </w:r>
+      <w:r>
+        <w:rPr>
+          <w:i/>
+          <w:iCs/>
+          <w:lang w:val="es-CL"/>
+        </w:rPr>
+        <w:t>12</w:t>
+      </w:r>
+      <w:r>
+        <w:rPr>
+          <w:lang w:val="es-CL"/>
+        </w:rPr>
+        <w:t xml:space="preserve">, 2825-2830. </w:t>
+      </w:r>
+      <w:hyperlink r:id="rId13" w:history="1">
+        <w:r>
+          <w:rPr>
+            <w:rStyle w:val="Hipervnculo"/>
+            <w:lang w:val="es-CL"/>
+          </w:rPr>
+          <w:t>https://jmlr.org/papers/v12/pedregosa11a.html</w:t>
+        </w:r>
+      </w:hyperlink>
     </w:p>
     <w:p>
+      <w:pPr>
+        <w:spacing w:after="160"/>
+        <w:jc w:val="both"/>
+        <w:rPr>
+          <w:lang w:val="es-CL"/>
+        </w:rPr>
+      </w:pPr>
+      <w:proofErr w:type="spellStart"/>
+      <w:r>
+        <w:rPr>
+          <w:lang w:val="es-CL"/>
+        </w:rPr>
+        <w:t>Ruete</w:t>
+      </w:r>
+      <w:proofErr w:type="spellEnd"/>
+      <w:r>
+        <w:rPr>
+          <w:lang w:val="es-CL"/>
+        </w:rPr>
+        <w:t xml:space="preserve">, D. (2026a). </w:t>
+      </w:r>
+      <w:r>
+        <w:rPr>
+          <w:i/>
+          <w:iCs/>
+          <w:lang w:val="es-CL"/>
+        </w:rPr>
+        <w:t>Fase 3: Redes neuronales para clasificación supervisada</w:t>
+      </w:r>
+      <w:r>
+        <w:rPr>
+          <w:lang w:val="es-CL"/>
+        </w:rPr>
+        <w:t xml:space="preserve"> [Apunte]. Universidad Andrés Bello, Santiago, Chile.</w:t>
+      </w:r>
+    </w:p>
+    <w:p>
+      <w:pPr>
+        <w:spacing w:after="160"/>
+        <w:jc w:val="both"/>
+        <w:rPr>
+          <w:lang w:val="es-CL"/>
+        </w:rPr>
+      </w:pPr>
+      <w:proofErr w:type="spellStart"/>
+      <w:r>
+        <w:rPr>
+          <w:lang w:val="es-CL"/>
+        </w:rPr>
+        <w:t>Ruete</w:t>
+      </w:r>
+      <w:proofErr w:type="spellEnd"/>
+      <w:r>
+        <w:rPr>
+          <w:lang w:val="es-CL"/>
+        </w:rPr>
+        <w:t xml:space="preserve">, D. (2026b). </w:t>
+      </w:r>
+      <w:r>
+        <w:rPr>
+          <w:i/>
+          <w:iCs/>
+          <w:lang w:val="es-CL"/>
+        </w:rPr>
+        <w:t xml:space="preserve">Introducción al Machine </w:t>
+      </w:r>
+      <w:proofErr w:type="spellStart"/>
+      <w:r>
+        <w:rPr>
+          <w:i/>
+          <w:iCs/>
+          <w:lang w:val="es-CL"/>
+        </w:rPr>
+        <w:t>Learning</w:t>
+      </w:r>
+      <w:proofErr w:type="spellEnd"/>
+      <w:r>
+        <w:rPr>
+          <w:lang w:val="es-CL"/>
+        </w:rPr>
+        <w:t xml:space="preserve"> [Apunte]. Universidad Andrés Bello, Santiago, Chile.</w:t>
+      </w:r>
+    </w:p>
+    <w:p>
+      <w:pPr>
+        <w:spacing w:after="160"/>
+        <w:jc w:val="both"/>
+        <w:rPr>
+          <w:lang w:val="es-CL"/>
+        </w:rPr>
+      </w:pPr>
+      <w:proofErr w:type="spellStart"/>
+      <w:r>
+        <w:rPr>
+          <w:lang w:val="es-CL"/>
+        </w:rPr>
+        <w:t>scikit-learn</w:t>
+      </w:r>
+      <w:proofErr w:type="spellEnd"/>
+      <w:r>
+        <w:rPr>
+          <w:lang w:val="es-CL"/>
+        </w:rPr>
+        <w:t xml:space="preserve"> </w:t>
+      </w:r>
+      <w:proofErr w:type="spellStart"/>
+      <w:r>
+        <w:rPr>
+          <w:lang w:val="es-CL"/>
+        </w:rPr>
+        <w:t>Developers</w:t>
+      </w:r>
+      <w:proofErr w:type="spellEnd"/>
+      <w:r>
+        <w:rPr>
+          <w:lang w:val="es-CL"/>
+        </w:rPr>
+        <w:t xml:space="preserve">. (2026a). </w:t>
+      </w:r>
+      <w:proofErr w:type="spellStart"/>
+      <w:r>
+        <w:rPr>
+          <w:i/>
+          <w:iCs/>
+          <w:lang w:val="es-CL"/>
+        </w:rPr>
+        <w:t>Metrics</w:t>
+      </w:r>
+      <w:proofErr w:type="spellEnd"/>
+      <w:r>
+        <w:rPr>
+          <w:i/>
+          <w:iCs/>
+          <w:lang w:val="es-CL"/>
+        </w:rPr>
+        <w:t xml:space="preserve"> and </w:t>
+      </w:r>
+      <w:proofErr w:type="spellStart"/>
+      <w:r>
+        <w:rPr>
+          <w:i/>
+          <w:iCs/>
+          <w:lang w:val="es-CL"/>
+        </w:rPr>
+        <w:t>scoring</w:t>
+      </w:r>
+      <w:proofErr w:type="spellEnd"/>
+      <w:r>
+        <w:rPr>
+          <w:i/>
+          <w:iCs/>
+          <w:lang w:val="es-CL"/>
+        </w:rPr>
+        <w:t xml:space="preserve">: </w:t>
+      </w:r>
+      <w:proofErr w:type="spellStart"/>
+      <w:r>
+        <w:rPr>
+          <w:i/>
+          <w:iCs/>
+          <w:lang w:val="es-CL"/>
+        </w:rPr>
+        <w:t>quantifying</w:t>
+      </w:r>
+      <w:proofErr w:type="spellEnd"/>
+      <w:r>
+        <w:rPr>
+          <w:i/>
+          <w:iCs/>
+          <w:lang w:val="es-CL"/>
+        </w:rPr>
+        <w:t xml:space="preserve"> </w:t>
+      </w:r>
+      <w:proofErr w:type="spellStart"/>
+      <w:r>
+        <w:rPr>
+          <w:i/>
+          <w:iCs/>
+          <w:lang w:val="es-CL"/>
+        </w:rPr>
+        <w:t>the</w:t>
+      </w:r>
+      <w:proofErr w:type="spellEnd"/>
+      <w:r>
+        <w:rPr>
+          <w:i/>
+          <w:iCs/>
+          <w:lang w:val="es-CL"/>
+        </w:rPr>
+        <w:t xml:space="preserve"> </w:t>
+      </w:r>
+      <w:proofErr w:type="spellStart"/>
+      <w:r>
+        <w:rPr>
+          <w:i/>
+          <w:iCs/>
+          <w:lang w:val="es-CL"/>
+        </w:rPr>
+        <w:t>quality</w:t>
+      </w:r>
+      <w:proofErr w:type="spellEnd"/>
+      <w:r>
+        <w:rPr>
+          <w:i/>
+          <w:iCs/>
+          <w:lang w:val="es-CL"/>
+        </w:rPr>
+        <w:t xml:space="preserve"> </w:t>
+      </w:r>
+      <w:proofErr w:type="spellStart"/>
+      <w:r>
+        <w:rPr>
+          <w:i/>
+          <w:iCs/>
+          <w:lang w:val="es-CL"/>
+        </w:rPr>
+        <w:t>of</w:t>
+      </w:r>
+      <w:proofErr w:type="spellEnd"/>
+      <w:r>
+        <w:rPr>
+          <w:i/>
+          <w:iCs/>
+          <w:lang w:val="es-CL"/>
+        </w:rPr>
+        <w:t xml:space="preserve"> </w:t>
+      </w:r>
+      <w:proofErr w:type="spellStart"/>
+      <w:r>
+        <w:rPr>
+          <w:i/>
+          <w:iCs/>
+          <w:lang w:val="es-CL"/>
+        </w:rPr>
+        <w:t>predictions</w:t>
+      </w:r>
+      <w:proofErr w:type="spellEnd"/>
+      <w:r>
+        <w:rPr>
+          <w:lang w:val="es-CL"/>
+        </w:rPr>
+        <w:t xml:space="preserve">. </w:t>
+      </w:r>
+      <w:proofErr w:type="spellStart"/>
+      <w:r>
+        <w:rPr>
+          <w:lang w:val="es-CL"/>
+        </w:rPr>
+        <w:t>scikit-learn</w:t>
+      </w:r>
+      <w:proofErr w:type="spellEnd"/>
+      <w:r>
+        <w:rPr>
+          <w:lang w:val="es-CL"/>
+        </w:rPr>
+        <w:t xml:space="preserve">. </w:t>
+      </w:r>
+      <w:hyperlink r:id="rId14" w:history="1">
+        <w:r>
+          <w:rPr>
+            <w:rStyle w:val="Hipervnculo"/>
+            <w:lang w:val="es-CL"/>
+          </w:rPr>
+          <w:t>https://scikit-learn.org/stable/modules/model_evaluation.html</w:t>
+        </w:r>
+      </w:hyperlink>
+    </w:p>
+    <w:p>
+      <w:pPr>
+        <w:spacing w:after="160"/>
+        <w:jc w:val="both"/>
+        <w:rPr>
+          <w:lang w:val="es-CL"/>
+        </w:rPr>
+      </w:pPr>
+      <w:proofErr w:type="spellStart"/>
+      <w:r>
+        <w:rPr>
+          <w:lang w:val="es-CL"/>
+        </w:rPr>
+        <w:t>scikit-learn</w:t>
+      </w:r>
+      <w:proofErr w:type="spellEnd"/>
+      <w:r>
+        <w:rPr>
+          <w:lang w:val="es-CL"/>
+        </w:rPr>
+        <w:t xml:space="preserve"> </w:t>
+      </w:r>
+      <w:proofErr w:type="spellStart"/>
+      <w:r>
+        <w:rPr>
+          <w:lang w:val="es-CL"/>
+        </w:rPr>
+        <w:t>Developers</w:t>
+      </w:r>
+      <w:proofErr w:type="spellEnd"/>
+      <w:r>
+        <w:rPr>
+          <w:lang w:val="es-CL"/>
+        </w:rPr>
+        <w:t xml:space="preserve">. (2026b). </w:t>
+      </w:r>
+      <w:proofErr w:type="spellStart"/>
+      <w:proofErr w:type="gramStart"/>
+      <w:r>
+        <w:rPr>
+          <w:i/>
+          <w:iCs/>
+          <w:lang w:val="es-CL"/>
+        </w:rPr>
+        <w:t>sklearn.neural</w:t>
+      </w:r>
+      <w:proofErr w:type="gramEnd"/>
+      <w:r>
+        <w:rPr>
+          <w:i/>
+          <w:iCs/>
+          <w:lang w:val="es-CL"/>
+        </w:rPr>
+        <w:t>_</w:t>
+      </w:r>
+      <w:proofErr w:type="gramStart"/>
+      <w:r>
+        <w:rPr>
+          <w:i/>
+          <w:iCs/>
+          <w:lang w:val="es-CL"/>
+        </w:rPr>
+        <w:t>network.MLPClassifier</w:t>
+      </w:r>
+      <w:proofErr w:type="spellEnd"/>
+      <w:proofErr w:type="gramEnd"/>
+      <w:r>
+        <w:rPr>
+          <w:lang w:val="es-CL"/>
+        </w:rPr>
+        <w:t xml:space="preserve">. </w:t>
+      </w:r>
+      <w:proofErr w:type="spellStart"/>
+      <w:r>
+        <w:rPr>
+          <w:lang w:val="es-CL"/>
+        </w:rPr>
+        <w:t>scikit-learn</w:t>
+      </w:r>
+      <w:proofErr w:type="spellEnd"/>
+      <w:r>
+        <w:rPr>
+          <w:lang w:val="es-CL"/>
+        </w:rPr>
+        <w:t xml:space="preserve">. </w:t>
+      </w:r>
+      <w:hyperlink r:id="rId15" w:history="1">
+        <w:r>
+          <w:rPr>
+            <w:rStyle w:val="Hipervnculo"/>
+            <w:lang w:val="es-CL"/>
+          </w:rPr>
+          <w:t>https://scikit-learn.org/stable/modules/generated/sklearn.neural_network.MLPClassifier.html</w:t>
+        </w:r>
+      </w:hyperlink>
+    </w:p>
+    <w:p>
+      <w:pPr>
+        <w:jc w:val="both"/>
+      </w:pPr>
+      <w:proofErr w:type="spellStart"/>
+      <w:r>
+        <w:t>Distribución</w:t>
+      </w:r>
+      <w:proofErr w:type="spellEnd"/>
+      <w:r>
+        <w:t xml:space="preserve"> de </w:t>
+      </w:r>
+      <w:proofErr w:type="spellStart"/>
+      <w:r>
+        <w:t>fuentes</w:t>
+      </w:r>
+      <w:proofErr w:type="spellEnd"/>
+      <w:r>
+        <w:t xml:space="preserve">: dos del material </w:t>
+      </w:r>
+      <w:proofErr w:type="spellStart"/>
+      <w:r>
+        <w:t>docente</w:t>
+      </w:r>
+      <w:proofErr w:type="spellEnd"/>
+      <w:r>
+        <w:t xml:space="preserve"> de la </w:t>
+      </w:r>
+      <w:proofErr w:type="spellStart"/>
+      <w:r>
+        <w:t>asignatura</w:t>
+      </w:r>
+      <w:proofErr w:type="spellEnd"/>
+      <w:r>
+        <w:t xml:space="preserve"> (</w:t>
+      </w:r>
+      <w:proofErr w:type="spellStart"/>
+      <w:r>
+        <w:t>Ruete</w:t>
+      </w:r>
+      <w:proofErr w:type="spellEnd"/>
+      <w:r>
+        <w:t xml:space="preserve">, 2026a, 2026b), dos de </w:t>
+      </w:r>
+      <w:proofErr w:type="spellStart"/>
+      <w:r>
+        <w:t>documentación</w:t>
+      </w:r>
+      <w:proofErr w:type="spellEnd"/>
+      <w:r>
+        <w:t xml:space="preserve"> </w:t>
+      </w:r>
+      <w:proofErr w:type="spellStart"/>
+      <w:r>
+        <w:t>técnica</w:t>
+      </w:r>
+      <w:proofErr w:type="spellEnd"/>
+      <w:r>
+        <w:t xml:space="preserve"> </w:t>
+      </w:r>
+      <w:proofErr w:type="spellStart"/>
+      <w:r>
+        <w:t>oficial</w:t>
+      </w:r>
+      <w:proofErr w:type="spellEnd"/>
+      <w:r>
+        <w:t xml:space="preserve"> del software </w:t>
+      </w:r>
+      <w:proofErr w:type="spellStart"/>
+      <w:r>
+        <w:t>utilizado</w:t>
+      </w:r>
+      <w:proofErr w:type="spellEnd"/>
+      <w:r>
+        <w:t xml:space="preserve"> (scikit-learn Developers, 2026a, 2026b) y dos </w:t>
+      </w:r>
+      <w:proofErr w:type="spellStart"/>
+      <w:r>
+        <w:t>académicas</w:t>
+      </w:r>
+      <w:proofErr w:type="spellEnd"/>
+      <w:r>
+        <w:t xml:space="preserve"> </w:t>
+      </w:r>
+      <w:proofErr w:type="spellStart"/>
+      <w:r>
+        <w:t>complementarias</w:t>
+      </w:r>
+      <w:proofErr w:type="spellEnd"/>
+      <w:r>
+        <w:t xml:space="preserve"> (Pedregosa et al., 2011; Goodfellow et al., 2016), </w:t>
+      </w:r>
+      <w:proofErr w:type="spellStart"/>
+      <w:r>
+        <w:t>cumpliendo</w:t>
+      </w:r>
+      <w:proofErr w:type="spellEnd"/>
+      <w:r>
+        <w:t xml:space="preserve"> el </w:t>
+      </w:r>
+      <w:proofErr w:type="spellStart"/>
+      <w:r>
+        <w:t>mínimo</w:t>
+      </w:r>
+      <w:proofErr w:type="spellEnd"/>
+      <w:r>
+        <w:t xml:space="preserve"> de </w:t>
+      </w:r>
+      <w:proofErr w:type="spellStart"/>
+      <w:r>
+        <w:t>cinco</w:t>
+      </w:r>
+      <w:proofErr w:type="spellEnd"/>
+      <w:r>
+        <w:t xml:space="preserve"> </w:t>
+      </w:r>
+      <w:proofErr w:type="spellStart"/>
+      <w:r>
+        <w:t>fuentes</w:t>
+      </w:r>
+      <w:proofErr w:type="spellEnd"/>
+      <w:r>
+        <w:t xml:space="preserve"> </w:t>
+      </w:r>
+      <w:proofErr w:type="spellStart"/>
+      <w:r>
+        <w:t>distribuidas</w:t>
+      </w:r>
+      <w:proofErr w:type="spellEnd"/>
+      <w:r>
+        <w:t xml:space="preserve"> </w:t>
+      </w:r>
+      <w:proofErr w:type="spellStart"/>
+      <w:r>
+        <w:t>en</w:t>
+      </w:r>
+      <w:proofErr w:type="spellEnd"/>
+      <w:r>
+        <w:t xml:space="preserve"> las </w:t>
+      </w:r>
+      <w:proofErr w:type="spellStart"/>
+      <w:r>
+        <w:t>tres</w:t>
+      </w:r>
+      <w:proofErr w:type="spellEnd"/>
+      <w:r>
+        <w:t xml:space="preserve"> </w:t>
+      </w:r>
+      <w:proofErr w:type="spellStart"/>
+      <w:r>
+        <w:t>categorías</w:t>
+      </w:r>
+      <w:proofErr w:type="spellEnd"/>
+      <w:r>
+        <w:t xml:space="preserve"> </w:t>
+      </w:r>
+      <w:proofErr w:type="spellStart"/>
+      <w:r>
+        <w:t>solicitadas</w:t>
+      </w:r>
+      <w:proofErr w:type="spellEnd"/>
+      <w:r>
+        <w:t xml:space="preserve">. </w:t>
+      </w:r>
+      <w:proofErr w:type="spellStart"/>
+      <w:r>
+        <w:t>Todas</w:t>
+      </w:r>
+      <w:proofErr w:type="spellEnd"/>
+      <w:r>
+        <w:t xml:space="preserve"> las </w:t>
+      </w:r>
+      <w:proofErr w:type="spellStart"/>
+      <w:r>
+        <w:t>fuentes</w:t>
+      </w:r>
+      <w:proofErr w:type="spellEnd"/>
+      <w:r>
+        <w:t xml:space="preserve"> </w:t>
+      </w:r>
+      <w:proofErr w:type="spellStart"/>
+      <w:r>
+        <w:t>listadas</w:t>
+      </w:r>
+      <w:proofErr w:type="spellEnd"/>
+      <w:r>
+        <w:t xml:space="preserve"> se </w:t>
+      </w:r>
+      <w:proofErr w:type="spellStart"/>
+      <w:r>
+        <w:t>citan</w:t>
+      </w:r>
+      <w:proofErr w:type="spellEnd"/>
+      <w:r>
+        <w:t xml:space="preserve"> </w:t>
+      </w:r>
+      <w:proofErr w:type="spellStart"/>
+      <w:r>
+        <w:t>en</w:t>
+      </w:r>
+      <w:proofErr w:type="spellEnd"/>
+      <w:r>
+        <w:t xml:space="preserve"> el </w:t>
+      </w:r>
+      <w:proofErr w:type="spellStart"/>
+      <w:r>
+        <w:t>desarrollo</w:t>
+      </w:r>
+      <w:proofErr w:type="spellEnd"/>
+      <w:r>
+        <w:t xml:space="preserve"> del </w:t>
+      </w:r>
+      <w:proofErr w:type="spellStart"/>
+      <w:r>
+        <w:t>informe</w:t>
+      </w:r>
+      <w:proofErr w:type="spellEnd"/>
+      <w:r>
+        <w:t>.</w:t>
+      </w:r>
       <w:r>
         <w:br w:type="page"/>
       </w:r>
@@ -7155,7 +8852,7 @@
     </w:p>
     <w:tbl>
       <w:tblPr>
-        <w:tblStyle w:val="TableGrid"/>
+        <w:tblStyle w:val="Tablaconcuadrcula"/>
         <w:tblW w:w="0" w:type="auto"/>
         <w:jc w:val="center"/>
         <w:tblLook w:val="04A0" w:firstRow="1" w:lastRow="0" w:firstColumn="1" w:lastColumn="0" w:noHBand="0" w:noVBand="1"/>
@@ -7882,7 +9579,7 @@
 </file>
 
 <file path=word/numbering.xml><?xml version="1.0" encoding="utf-8"?>
-<w:numbering xmlns:wpc="http://schemas.microsoft.com/office/word/2010/wordprocessingCanvas" xmlns:cx="http://schemas.microsoft.com/office/drawing/2014/chartex" xmlns:cx1="http://schemas.microsoft.com/office/drawing/2015/9/8/chartex" xmlns:cx2="http://schemas.microsoft.com/office/drawing/2015/10/21/chartex" xmlns:cx3="http://schemas.microsoft.com/office/drawing/2016/5/9/chartex" xmlns:cx4="http://schemas.microsoft.com/office/drawing/2016/5/10/chartex" xmlns:cx5="http://schemas.microsoft.com/office/drawing/2016/5/11/chartex" xmlns:cx6="http://schemas.microsoft.com/office/drawing/2016/5/12/chartex" xmlns:cx7="http://schemas.microsoft.com/office/drawing/2016/5/13/chartex" xmlns:cx8="http://schemas.microsoft.com/office/drawing/2016/5/14/chartex" xmlns:mc="http://schemas.openxmlformats.org/markup-compatibility/2006" xmlns:m="http://schemas.openxmlformats.org/officeDocument/2006/math" xmlns:aink="http://schemas.microsoft.com/office/drawing/2016/ink" xmlns:am3d="http://schemas.microsoft.com/office/drawing/2017/model3d" xmlns:oel="http://schemas.microsoft.com/office/2019/extlst" xmlns:r="http://schemas.openxmlformats.org/officeDocument/2006/relationships" xmlns:wp14="http://schemas.microsoft.com/office/word/2010/wordprocessingDrawing" xmlns:wp="http://schemas.openxmlformats.org/drawingml/2006/wordprocessingDrawing" xmlns:wpg="http://schemas.microsoft.com/office/word/2010/wordprocessingGroup" xmlns:wpi="http://schemas.microsoft.com/office/word/2010/wordprocessingInk" xmlns:wps="http://schemas.microsoft.com/office/word/2010/wordprocessingShape" xmlns:o="urn:schemas-microsoft-com:office:office" xmlns:v="urn:schemas-microsoft-com:vml" xmlns:w10="urn:schemas-microsoft-com:office:word" xmlns:w="http://schemas.openxmlformats.org/wordprocessingml/2006/main" xmlns:w14="http://schemas.microsoft.com/office/word/2010/wordml" xmlns:w15="http://schemas.microsoft.com/office/word/2012/wordml" xmlns:w16cex="http://schemas.microsoft.com/office/word/2018/wordml/cex" xmlns:w16cid="http://schemas.microsoft.com/office/word/2016/wordml/cid" xmlns:w16="http://schemas.microsoft.com/office/word/2018/wordml" xmlns:w16sdtdh="http://schemas.microsoft.com/office/word/2020/wordml/sdtdatahash" xmlns:w16sdtfl="http://schemas.microsoft.com/office/word/2024/wordml/sdtformatlock" xmlns:w16se="http://schemas.microsoft.com/office/word/2015/wordml/symex" xmlns:w16du="http://schemas.microsoft.com/office/word/2023/wordml/word16du" xmlns:wne="http://schemas.microsoft.com/office/word/2006/wordml" mc:Ignorable="w14 w15 w16se w16cid w16 w16cex w16sdtdh w16sdtfl w16du wp14">
+<w:numbering xmlns:wpc="http://schemas.microsoft.com/office/word/2010/wordprocessingCanvas" xmlns:cx="http://schemas.microsoft.com/office/drawing/2014/chartex" xmlns:cx1="http://schemas.microsoft.com/office/drawing/2015/9/8/chartex" xmlns:cx2="http://schemas.microsoft.com/office/drawing/2015/10/21/chartex" xmlns:cx3="http://schemas.microsoft.com/office/drawing/2016/5/9/chartex" xmlns:cx4="http://schemas.microsoft.com/office/drawing/2016/5/10/chartex" xmlns:cx5="http://schemas.microsoft.com/office/drawing/2016/5/11/chartex" xmlns:cx6="http://schemas.microsoft.com/office/drawing/2016/5/12/chartex" xmlns:cx7="http://schemas.microsoft.com/office/drawing/2016/5/13/chartex" xmlns:cx8="http://schemas.microsoft.com/office/drawing/2016/5/14/chartex" xmlns:mc="http://schemas.openxmlformats.org/markup-compatibility/2006" xmlns:aink="http://schemas.microsoft.com/office/drawing/2016/ink" xmlns:am3d="http://schemas.microsoft.com/office/drawing/2017/model3d" xmlns:o="urn:schemas-microsoft-com:office:office" xmlns:oel="http://schemas.microsoft.com/office/2019/extlst" xmlns:r="http://schemas.openxmlformats.org/officeDocument/2006/relationships" xmlns:m="http://schemas.openxmlformats.org/officeDocument/2006/math" xmlns:v="urn:schemas-microsoft-com:vml" xmlns:wp14="http://schemas.microsoft.com/office/word/2010/wordprocessingDrawing" xmlns:wp="http://schemas.openxmlformats.org/drawingml/2006/wordprocessingDrawing" xmlns:w10="urn:schemas-microsoft-com:office:word" xmlns:w="http://schemas.openxmlformats.org/wordprocessingml/2006/main" xmlns:w14="http://schemas.microsoft.com/office/word/2010/wordml" xmlns:w15="http://schemas.microsoft.com/office/word/2012/wordml" xmlns:w16cex="http://schemas.microsoft.com/office/word/2018/wordml/cex" xmlns:w16cid="http://schemas.microsoft.com/office/word/2016/wordml/cid" xmlns:w16="http://schemas.microsoft.com/office/word/2018/wordml" xmlns:w16du="http://schemas.microsoft.com/office/word/2023/wordml/word16du" xmlns:w16sdtdh="http://schemas.microsoft.com/office/word/2020/wordml/sdtdatahash" xmlns:w16sdtfl="http://schemas.microsoft.com/office/word/2024/wordml/sdtformatlock" xmlns:w16se="http://schemas.microsoft.com/office/word/2015/wordml/symex" xmlns:wpg="http://schemas.microsoft.com/office/word/2010/wordprocessingGroup" xmlns:wpi="http://schemas.microsoft.com/office/word/2010/wordprocessingInk" xmlns:wne="http://schemas.microsoft.com/office/word/2006/wordml" xmlns:wps="http://schemas.microsoft.com/office/word/2010/wordprocessingShape" mc:Ignorable="w14 w15 w16se w16cid w16 w16cex w16sdtdh w16sdtfl w16du wp14">
   <w:abstractNum w:abstractNumId="0" w15:restartNumberingAfterBreak="0">
     <w:nsid w:val="FFFFFF7C"/>
     <w:multiLevelType w:val="singleLevel"/>
@@ -7924,7 +9621,7 @@
     <w:lvl w:ilvl="0">
       <w:start w:val="1"/>
       <w:numFmt w:val="decimal"/>
-      <w:pStyle w:val="ListNumber3"/>
+      <w:pStyle w:val="Listaconnmeros3"/>
       <w:lvlText w:val="%1."/>
       <w:lvlJc w:val="left"/>
       <w:pPr>
@@ -7942,7 +9639,7 @@
     <w:lvl w:ilvl="0">
       <w:start w:val="1"/>
       <w:numFmt w:val="decimal"/>
-      <w:pStyle w:val="ListNumber2"/>
+      <w:pStyle w:val="Listaconnmeros2"/>
       <w:lvlText w:val="%1."/>
       <w:lvlJc w:val="left"/>
       <w:pPr>
@@ -7980,7 +9677,7 @@
     <w:lvl w:ilvl="0">
       <w:start w:val="1"/>
       <w:numFmt w:val="bullet"/>
-      <w:pStyle w:val="ListBullet3"/>
+      <w:pStyle w:val="Listaconvietas3"/>
       <w:lvlText w:val=""/>
       <w:lvlJc w:val="left"/>
       <w:pPr>
@@ -8001,7 +9698,7 @@
     <w:lvl w:ilvl="0">
       <w:start w:val="1"/>
       <w:numFmt w:val="bullet"/>
-      <w:pStyle w:val="ListBullet2"/>
+      <w:pStyle w:val="Listaconvietas2"/>
       <w:lvlText w:val=""/>
       <w:lvlJc w:val="left"/>
       <w:pPr>
@@ -8022,7 +9719,7 @@
     <w:lvl w:ilvl="0">
       <w:start w:val="1"/>
       <w:numFmt w:val="decimal"/>
-      <w:pStyle w:val="ListNumber"/>
+      <w:pStyle w:val="Listaconnmeros"/>
       <w:lvlText w:val="%1."/>
       <w:lvlJc w:val="left"/>
       <w:pPr>
@@ -8040,7 +9737,7 @@
     <w:lvl w:ilvl="0">
       <w:start w:val="1"/>
       <w:numFmt w:val="bullet"/>
-      <w:pStyle w:val="ListBullet"/>
+      <w:pStyle w:val="Listaconvietas"/>
       <w:lvlText w:val=""/>
       <w:lvlJc w:val="left"/>
       <w:pPr>
@@ -8085,7 +9782,7 @@
 </file>
 
 <file path=word/styles.xml><?xml version="1.0" encoding="utf-8"?>
-<w:styles xmlns:mc="http://schemas.openxmlformats.org/markup-compatibility/2006" xmlns:r="http://schemas.openxmlformats.org/officeDocument/2006/relationships" xmlns:w="http://schemas.openxmlformats.org/wordprocessingml/2006/main" xmlns:w14="http://schemas.microsoft.com/office/word/2010/wordml" xmlns:w15="http://schemas.microsoft.com/office/word/2012/wordml" xmlns:w16cex="http://schemas.microsoft.com/office/word/2018/wordml/cex" xmlns:w16cid="http://schemas.microsoft.com/office/word/2016/wordml/cid" xmlns:w16="http://schemas.microsoft.com/office/word/2018/wordml" xmlns:w16sdtdh="http://schemas.microsoft.com/office/word/2020/wordml/sdtdatahash" xmlns:w16sdtfl="http://schemas.microsoft.com/office/word/2024/wordml/sdtformatlock" xmlns:w16se="http://schemas.microsoft.com/office/word/2015/wordml/symex" xmlns:w16du="http://schemas.microsoft.com/office/word/2023/wordml/word16du" mc:Ignorable="w14 w15 w16se w16cid w16 w16cex w16sdtdh w16sdtfl w16du">
+<w:styles xmlns:mc="http://schemas.openxmlformats.org/markup-compatibility/2006" xmlns:r="http://schemas.openxmlformats.org/officeDocument/2006/relationships" xmlns:w="http://schemas.openxmlformats.org/wordprocessingml/2006/main" xmlns:w14="http://schemas.microsoft.com/office/word/2010/wordml" xmlns:w15="http://schemas.microsoft.com/office/word/2012/wordml" xmlns:w16cex="http://schemas.microsoft.com/office/word/2018/wordml/cex" xmlns:w16cid="http://schemas.microsoft.com/office/word/2016/wordml/cid" xmlns:w16="http://schemas.microsoft.com/office/word/2018/wordml" xmlns:w16du="http://schemas.microsoft.com/office/word/2023/wordml/word16du" xmlns:w16sdtdh="http://schemas.microsoft.com/office/word/2020/wordml/sdtdatahash" xmlns:w16sdtfl="http://schemas.microsoft.com/office/word/2024/wordml/sdtformatlock" xmlns:w16se="http://schemas.microsoft.com/office/word/2015/wordml/symex" mc:Ignorable="w14 w15 w16se w16cid w16 w16cex w16sdtdh w16sdtfl w16du">
   <w:docDefaults>
     <w:rPrDefault>
       <w:rPr>
@@ -8478,11 +10175,11 @@
       <w:rFonts w:ascii="Arial" w:eastAsia="Arial" w:hAnsi="Arial"/>
     </w:rPr>
   </w:style>
-  <w:style w:type="paragraph" w:styleId="Heading1">
+  <w:style w:type="paragraph" w:styleId="Ttulo1">
     <w:name w:val="heading 1"/>
     <w:basedOn w:val="Normal"/>
     <w:next w:val="Normal"/>
-    <w:link w:val="Heading1Char"/>
+    <w:link w:val="Ttulo1Car"/>
     <w:uiPriority w:val="9"/>
     <w:qFormat/>
     <w:rsid w:val="00FC693F"/>
@@ -8501,11 +10198,11 @@
       <w:szCs w:val="28"/>
     </w:rPr>
   </w:style>
-  <w:style w:type="paragraph" w:styleId="Heading2">
+  <w:style w:type="paragraph" w:styleId="Ttulo2">
     <w:name w:val="heading 2"/>
     <w:basedOn w:val="Normal"/>
     <w:next w:val="Normal"/>
-    <w:link w:val="Heading2Char"/>
+    <w:link w:val="Ttulo2Car"/>
     <w:uiPriority w:val="9"/>
     <w:unhideWhenUsed/>
     <w:qFormat/>
@@ -8525,11 +10222,11 @@
       <w:szCs w:val="26"/>
     </w:rPr>
   </w:style>
-  <w:style w:type="paragraph" w:styleId="Heading3">
+  <w:style w:type="paragraph" w:styleId="Ttulo3">
     <w:name w:val="heading 3"/>
     <w:basedOn w:val="Normal"/>
     <w:next w:val="Normal"/>
-    <w:link w:val="Heading3Char"/>
+    <w:link w:val="Ttulo3Car"/>
     <w:uiPriority w:val="9"/>
     <w:unhideWhenUsed/>
     <w:qFormat/>
@@ -8547,11 +10244,11 @@
       <w:color w:val="4F81BD" w:themeColor="accent1"/>
     </w:rPr>
   </w:style>
-  <w:style w:type="paragraph" w:styleId="Heading4">
+  <w:style w:type="paragraph" w:styleId="Ttulo4">
     <w:name w:val="heading 4"/>
     <w:basedOn w:val="Normal"/>
     <w:next w:val="Normal"/>
-    <w:link w:val="Heading4Char"/>
+    <w:link w:val="Ttulo4Car"/>
     <w:uiPriority w:val="9"/>
     <w:semiHidden/>
     <w:unhideWhenUsed/>
@@ -8572,11 +10269,11 @@
       <w:color w:val="4F81BD" w:themeColor="accent1"/>
     </w:rPr>
   </w:style>
-  <w:style w:type="paragraph" w:styleId="Heading5">
+  <w:style w:type="paragraph" w:styleId="Ttulo5">
     <w:name w:val="heading 5"/>
     <w:basedOn w:val="Normal"/>
     <w:next w:val="Normal"/>
-    <w:link w:val="Heading5Char"/>
+    <w:link w:val="Ttulo5Car"/>
     <w:uiPriority w:val="9"/>
     <w:semiHidden/>
     <w:unhideWhenUsed/>
@@ -8593,11 +10290,11 @@
       <w:color w:val="243F60" w:themeColor="accent1" w:themeShade="7F"/>
     </w:rPr>
   </w:style>
-  <w:style w:type="paragraph" w:styleId="Heading6">
+  <w:style w:type="paragraph" w:styleId="Ttulo6">
     <w:name w:val="heading 6"/>
     <w:basedOn w:val="Normal"/>
     <w:next w:val="Normal"/>
-    <w:link w:val="Heading6Char"/>
+    <w:link w:val="Ttulo6Car"/>
     <w:uiPriority w:val="9"/>
     <w:semiHidden/>
     <w:unhideWhenUsed/>
@@ -8616,11 +10313,11 @@
       <w:color w:val="243F60" w:themeColor="accent1" w:themeShade="7F"/>
     </w:rPr>
   </w:style>
-  <w:style w:type="paragraph" w:styleId="Heading7">
+  <w:style w:type="paragraph" w:styleId="Ttulo7">
     <w:name w:val="heading 7"/>
     <w:basedOn w:val="Normal"/>
     <w:next w:val="Normal"/>
-    <w:link w:val="Heading7Char"/>
+    <w:link w:val="Ttulo7Car"/>
     <w:uiPriority w:val="9"/>
     <w:semiHidden/>
     <w:unhideWhenUsed/>
@@ -8639,11 +10336,11 @@
       <w:color w:val="404040" w:themeColor="text1" w:themeTint="BF"/>
     </w:rPr>
   </w:style>
-  <w:style w:type="paragraph" w:styleId="Heading8">
+  <w:style w:type="paragraph" w:styleId="Ttulo8">
     <w:name w:val="heading 8"/>
     <w:basedOn w:val="Normal"/>
     <w:next w:val="Normal"/>
-    <w:link w:val="Heading8Char"/>
+    <w:link w:val="Ttulo8Car"/>
     <w:uiPriority w:val="9"/>
     <w:semiHidden/>
     <w:unhideWhenUsed/>
@@ -8662,11 +10359,11 @@
       <w:szCs w:val="20"/>
     </w:rPr>
   </w:style>
-  <w:style w:type="paragraph" w:styleId="Heading9">
+  <w:style w:type="paragraph" w:styleId="Ttulo9">
     <w:name w:val="heading 9"/>
     <w:basedOn w:val="Normal"/>
     <w:next w:val="Normal"/>
-    <w:link w:val="Heading9Char"/>
+    <w:link w:val="Ttulo9Car"/>
     <w:uiPriority w:val="9"/>
     <w:semiHidden/>
     <w:unhideWhenUsed/>
@@ -8687,13 +10384,12 @@
       <w:szCs w:val="20"/>
     </w:rPr>
   </w:style>
-  <w:style w:type="character" w:default="1" w:styleId="DefaultParagraphFont">
+  <w:style w:type="character" w:default="1" w:styleId="Fuentedeprrafopredeter">
     <w:name w:val="Default Paragraph Font"/>
     <w:uiPriority w:val="1"/>
-    <w:semiHidden/>
     <w:unhideWhenUsed/>
   </w:style>
-  <w:style w:type="table" w:default="1" w:styleId="TableNormal">
+  <w:style w:type="table" w:default="1" w:styleId="Tablanormal">
     <w:name w:val="Normal Table"/>
     <w:uiPriority w:val="99"/>
     <w:semiHidden/>
@@ -8708,16 +10404,16 @@
       </w:tblCellMar>
     </w:tblPr>
   </w:style>
-  <w:style w:type="numbering" w:default="1" w:styleId="NoList">
+  <w:style w:type="numbering" w:default="1" w:styleId="Sinlista">
     <w:name w:val="No List"/>
     <w:uiPriority w:val="99"/>
     <w:semiHidden/>
     <w:unhideWhenUsed/>
   </w:style>
-  <w:style w:type="paragraph" w:styleId="Header">
+  <w:style w:type="paragraph" w:styleId="Encabezado">
     <w:name w:val="header"/>
     <w:basedOn w:val="Normal"/>
-    <w:link w:val="HeaderChar"/>
+    <w:link w:val="EncabezadoCar"/>
     <w:uiPriority w:val="99"/>
     <w:unhideWhenUsed/>
     <w:rsid w:val="00E618BF"/>
@@ -8729,17 +10425,17 @@
       <w:spacing w:after="0" w:line="240" w:lineRule="auto"/>
     </w:pPr>
   </w:style>
-  <w:style w:type="character" w:customStyle="1" w:styleId="HeaderChar">
-    <w:name w:val="Header Char"/>
-    <w:basedOn w:val="DefaultParagraphFont"/>
-    <w:link w:val="Header"/>
+  <w:style w:type="character" w:customStyle="1" w:styleId="EncabezadoCar">
+    <w:name w:val="Encabezado Car"/>
+    <w:basedOn w:val="Fuentedeprrafopredeter"/>
+    <w:link w:val="Encabezado"/>
     <w:uiPriority w:val="99"/>
     <w:rsid w:val="00E618BF"/>
   </w:style>
-  <w:style w:type="paragraph" w:styleId="Footer">
+  <w:style w:type="paragraph" w:styleId="Piedepgina">
     <w:name w:val="footer"/>
     <w:basedOn w:val="Normal"/>
-    <w:link w:val="FooterChar"/>
+    <w:link w:val="PiedepginaCar"/>
     <w:uiPriority w:val="99"/>
     <w:unhideWhenUsed/>
     <w:rsid w:val="00E618BF"/>
@@ -8751,14 +10447,14 @@
       <w:spacing w:after="0" w:line="240" w:lineRule="auto"/>
     </w:pPr>
   </w:style>
-  <w:style w:type="character" w:customStyle="1" w:styleId="FooterChar">
-    <w:name w:val="Footer Char"/>
-    <w:basedOn w:val="DefaultParagraphFont"/>
-    <w:link w:val="Footer"/>
+  <w:style w:type="character" w:customStyle="1" w:styleId="PiedepginaCar">
+    <w:name w:val="Pie de página Car"/>
+    <w:basedOn w:val="Fuentedeprrafopredeter"/>
+    <w:link w:val="Piedepgina"/>
     <w:uiPriority w:val="99"/>
     <w:rsid w:val="00E618BF"/>
   </w:style>
-  <w:style w:type="paragraph" w:styleId="NoSpacing">
+  <w:style w:type="paragraph" w:styleId="Sinespaciado">
     <w:name w:val="No Spacing"/>
     <w:uiPriority w:val="1"/>
     <w:qFormat/>
@@ -8767,10 +10463,10 @@
       <w:spacing w:after="0" w:line="240" w:lineRule="auto"/>
     </w:pPr>
   </w:style>
-  <w:style w:type="character" w:customStyle="1" w:styleId="Heading1Char">
-    <w:name w:val="Heading 1 Char"/>
-    <w:basedOn w:val="DefaultParagraphFont"/>
-    <w:link w:val="Heading1"/>
+  <w:style w:type="character" w:customStyle="1" w:styleId="Ttulo1Car">
+    <w:name w:val="Título 1 Car"/>
+    <w:basedOn w:val="Fuentedeprrafopredeter"/>
+    <w:link w:val="Ttulo1"/>
     <w:uiPriority w:val="9"/>
     <w:rsid w:val="00FC693F"/>
     <w:rPr>
@@ -8782,10 +10478,10 @@
       <w:szCs w:val="28"/>
     </w:rPr>
   </w:style>
-  <w:style w:type="character" w:customStyle="1" w:styleId="Heading2Char">
-    <w:name w:val="Heading 2 Char"/>
-    <w:basedOn w:val="DefaultParagraphFont"/>
-    <w:link w:val="Heading2"/>
+  <w:style w:type="character" w:customStyle="1" w:styleId="Ttulo2Car">
+    <w:name w:val="Título 2 Car"/>
+    <w:basedOn w:val="Fuentedeprrafopredeter"/>
+    <w:link w:val="Ttulo2"/>
     <w:uiPriority w:val="9"/>
     <w:rsid w:val="00FC693F"/>
     <w:rPr>
@@ -8797,10 +10493,10 @@
       <w:szCs w:val="26"/>
     </w:rPr>
   </w:style>
-  <w:style w:type="character" w:customStyle="1" w:styleId="Heading3Char">
-    <w:name w:val="Heading 3 Char"/>
-    <w:basedOn w:val="DefaultParagraphFont"/>
-    <w:link w:val="Heading3"/>
+  <w:style w:type="character" w:customStyle="1" w:styleId="Ttulo3Car">
+    <w:name w:val="Título 3 Car"/>
+    <w:basedOn w:val="Fuentedeprrafopredeter"/>
+    <w:link w:val="Ttulo3"/>
     <w:uiPriority w:val="9"/>
     <w:rsid w:val="00FC693F"/>
     <w:rPr>
@@ -8810,11 +10506,11 @@
       <w:color w:val="4F81BD" w:themeColor="accent1"/>
     </w:rPr>
   </w:style>
-  <w:style w:type="paragraph" w:styleId="Title">
+  <w:style w:type="paragraph" w:styleId="Ttulo">
     <w:name w:val="Title"/>
     <w:basedOn w:val="Normal"/>
     <w:next w:val="Normal"/>
-    <w:link w:val="TitleChar"/>
+    <w:link w:val="TtuloCar"/>
     <w:uiPriority w:val="10"/>
     <w:qFormat/>
     <w:rsid w:val="00FC693F"/>
@@ -8834,10 +10530,10 @@
       <w:szCs w:val="52"/>
     </w:rPr>
   </w:style>
-  <w:style w:type="character" w:customStyle="1" w:styleId="TitleChar">
-    <w:name w:val="Title Char"/>
-    <w:basedOn w:val="DefaultParagraphFont"/>
-    <w:link w:val="Title"/>
+  <w:style w:type="character" w:customStyle="1" w:styleId="TtuloCar">
+    <w:name w:val="Título Car"/>
+    <w:basedOn w:val="Fuentedeprrafopredeter"/>
+    <w:link w:val="Ttulo"/>
     <w:uiPriority w:val="10"/>
     <w:rsid w:val="00FC693F"/>
     <w:rPr>
@@ -8849,11 +10545,11 @@
       <w:szCs w:val="52"/>
     </w:rPr>
   </w:style>
-  <w:style w:type="paragraph" w:styleId="Subtitle">
+  <w:style w:type="paragraph" w:styleId="Subttulo">
     <w:name w:val="Subtitle"/>
     <w:basedOn w:val="Normal"/>
     <w:next w:val="Normal"/>
-    <w:link w:val="SubtitleChar"/>
+    <w:link w:val="SubttuloCar"/>
     <w:uiPriority w:val="11"/>
     <w:qFormat/>
     <w:rsid w:val="00FC693F"/>
@@ -8872,10 +10568,10 @@
       <w:szCs w:val="24"/>
     </w:rPr>
   </w:style>
-  <w:style w:type="character" w:customStyle="1" w:styleId="SubtitleChar">
-    <w:name w:val="Subtitle Char"/>
-    <w:basedOn w:val="DefaultParagraphFont"/>
-    <w:link w:val="Subtitle"/>
+  <w:style w:type="character" w:customStyle="1" w:styleId="SubttuloCar">
+    <w:name w:val="Subtítulo Car"/>
+    <w:basedOn w:val="Fuentedeprrafopredeter"/>
+    <w:link w:val="Subttulo"/>
     <w:uiPriority w:val="11"/>
     <w:rsid w:val="00FC693F"/>
     <w:rPr>
@@ -8888,7 +10584,7 @@
       <w:szCs w:val="24"/>
     </w:rPr>
   </w:style>
-  <w:style w:type="paragraph" w:styleId="ListParagraph">
+  <w:style w:type="paragraph" w:styleId="Prrafodelista">
     <w:name w:val="List Paragraph"/>
     <w:basedOn w:val="Normal"/>
     <w:uiPriority w:val="34"/>
@@ -8899,10 +10595,10 @@
       <w:contextualSpacing/>
     </w:pPr>
   </w:style>
-  <w:style w:type="paragraph" w:styleId="BodyText">
+  <w:style w:type="paragraph" w:styleId="Textoindependiente">
     <w:name w:val="Body Text"/>
     <w:basedOn w:val="Normal"/>
-    <w:link w:val="BodyTextChar"/>
+    <w:link w:val="TextoindependienteCar"/>
     <w:uiPriority w:val="99"/>
     <w:unhideWhenUsed/>
     <w:rsid w:val="00AA1D8D"/>
@@ -8910,17 +10606,17 @@
       <w:spacing w:after="120"/>
     </w:pPr>
   </w:style>
-  <w:style w:type="character" w:customStyle="1" w:styleId="BodyTextChar">
-    <w:name w:val="Body Text Char"/>
-    <w:basedOn w:val="DefaultParagraphFont"/>
-    <w:link w:val="BodyText"/>
+  <w:style w:type="character" w:customStyle="1" w:styleId="TextoindependienteCar">
+    <w:name w:val="Texto independiente Car"/>
+    <w:basedOn w:val="Fuentedeprrafopredeter"/>
+    <w:link w:val="Textoindependiente"/>
     <w:uiPriority w:val="99"/>
     <w:rsid w:val="00AA1D8D"/>
   </w:style>
-  <w:style w:type="paragraph" w:styleId="BodyText2">
+  <w:style w:type="paragraph" w:styleId="Textoindependiente2">
     <w:name w:val="Body Text 2"/>
     <w:basedOn w:val="Normal"/>
-    <w:link w:val="BodyText2Char"/>
+    <w:link w:val="Textoindependiente2Car"/>
     <w:uiPriority w:val="99"/>
     <w:unhideWhenUsed/>
     <w:rsid w:val="00AA1D8D"/>
@@ -8928,17 +10624,17 @@
       <w:spacing w:after="120" w:line="480" w:lineRule="auto"/>
     </w:pPr>
   </w:style>
-  <w:style w:type="character" w:customStyle="1" w:styleId="BodyText2Char">
-    <w:name w:val="Body Text 2 Char"/>
-    <w:basedOn w:val="DefaultParagraphFont"/>
-    <w:link w:val="BodyText2"/>
+  <w:style w:type="character" w:customStyle="1" w:styleId="Textoindependiente2Car">
+    <w:name w:val="Texto independiente 2 Car"/>
+    <w:basedOn w:val="Fuentedeprrafopredeter"/>
+    <w:link w:val="Textoindependiente2"/>
     <w:uiPriority w:val="99"/>
     <w:rsid w:val="00AA1D8D"/>
   </w:style>
-  <w:style w:type="paragraph" w:styleId="BodyText3">
+  <w:style w:type="paragraph" w:styleId="Textoindependiente3">
     <w:name w:val="Body Text 3"/>
     <w:basedOn w:val="Normal"/>
-    <w:link w:val="BodyText3Char"/>
+    <w:link w:val="Textoindependiente3Car"/>
     <w:uiPriority w:val="99"/>
     <w:unhideWhenUsed/>
     <w:rsid w:val="00AA1D8D"/>
@@ -8950,10 +10646,10 @@
       <w:szCs w:val="16"/>
     </w:rPr>
   </w:style>
-  <w:style w:type="character" w:customStyle="1" w:styleId="BodyText3Char">
-    <w:name w:val="Body Text 3 Char"/>
-    <w:basedOn w:val="DefaultParagraphFont"/>
-    <w:link w:val="BodyText3"/>
+  <w:style w:type="character" w:customStyle="1" w:styleId="Textoindependiente3Car">
+    <w:name w:val="Texto independiente 3 Car"/>
+    <w:basedOn w:val="Fuentedeprrafopredeter"/>
+    <w:link w:val="Textoindependiente3"/>
     <w:uiPriority w:val="99"/>
     <w:rsid w:val="00AA1D8D"/>
     <w:rPr>
@@ -8961,7 +10657,7 @@
       <w:szCs w:val="16"/>
     </w:rPr>
   </w:style>
-  <w:style w:type="paragraph" w:styleId="List">
+  <w:style w:type="paragraph" w:styleId="Lista">
     <w:name w:val="List"/>
     <w:basedOn w:val="Normal"/>
     <w:uiPriority w:val="99"/>
@@ -8972,7 +10668,7 @@
       <w:contextualSpacing/>
     </w:pPr>
   </w:style>
-  <w:style w:type="paragraph" w:styleId="List2">
+  <w:style w:type="paragraph" w:styleId="Lista2">
     <w:name w:val="List 2"/>
     <w:basedOn w:val="Normal"/>
     <w:uiPriority w:val="99"/>
@@ -8983,7 +10679,7 @@
       <w:contextualSpacing/>
     </w:pPr>
   </w:style>
-  <w:style w:type="paragraph" w:styleId="List3">
+  <w:style w:type="paragraph" w:styleId="Lista3">
     <w:name w:val="List 3"/>
     <w:basedOn w:val="Normal"/>
     <w:uiPriority w:val="99"/>
@@ -8994,7 +10690,7 @@
       <w:contextualSpacing/>
     </w:pPr>
   </w:style>
-  <w:style w:type="paragraph" w:styleId="ListBullet">
+  <w:style w:type="paragraph" w:styleId="Listaconvietas">
     <w:name w:val="List Bullet"/>
     <w:basedOn w:val="Normal"/>
     <w:uiPriority w:val="99"/>
@@ -9007,7 +10703,7 @@
       <w:contextualSpacing/>
     </w:pPr>
   </w:style>
-  <w:style w:type="paragraph" w:styleId="ListBullet2">
+  <w:style w:type="paragraph" w:styleId="Listaconvietas2">
     <w:name w:val="List Bullet 2"/>
     <w:basedOn w:val="Normal"/>
     <w:uiPriority w:val="99"/>
@@ -9020,7 +10716,7 @@
       <w:contextualSpacing/>
     </w:pPr>
   </w:style>
-  <w:style w:type="paragraph" w:styleId="ListBullet3">
+  <w:style w:type="paragraph" w:styleId="Listaconvietas3">
     <w:name w:val="List Bullet 3"/>
     <w:basedOn w:val="Normal"/>
     <w:uiPriority w:val="99"/>
@@ -9033,7 +10729,7 @@
       <w:contextualSpacing/>
     </w:pPr>
   </w:style>
-  <w:style w:type="paragraph" w:styleId="ListNumber">
+  <w:style w:type="paragraph" w:styleId="Listaconnmeros">
     <w:name w:val="List Number"/>
     <w:basedOn w:val="Normal"/>
     <w:uiPriority w:val="99"/>
@@ -9046,7 +10742,7 @@
       <w:contextualSpacing/>
     </w:pPr>
   </w:style>
-  <w:style w:type="paragraph" w:styleId="ListNumber2">
+  <w:style w:type="paragraph" w:styleId="Listaconnmeros2">
     <w:name w:val="List Number 2"/>
     <w:basedOn w:val="Normal"/>
     <w:uiPriority w:val="99"/>
@@ -9059,7 +10755,7 @@
       <w:contextualSpacing/>
     </w:pPr>
   </w:style>
-  <w:style w:type="paragraph" w:styleId="ListNumber3">
+  <w:style w:type="paragraph" w:styleId="Listaconnmeros3">
     <w:name w:val="List Number 3"/>
     <w:basedOn w:val="Normal"/>
     <w:uiPriority w:val="99"/>
@@ -9072,7 +10768,7 @@
       <w:contextualSpacing/>
     </w:pPr>
   </w:style>
-  <w:style w:type="paragraph" w:styleId="ListContinue">
+  <w:style w:type="paragraph" w:styleId="Continuarlista">
     <w:name w:val="List Continue"/>
     <w:basedOn w:val="Normal"/>
     <w:uiPriority w:val="99"/>
@@ -9084,7 +10780,7 @@
       <w:contextualSpacing/>
     </w:pPr>
   </w:style>
-  <w:style w:type="paragraph" w:styleId="ListContinue2">
+  <w:style w:type="paragraph" w:styleId="Continuarlista2">
     <w:name w:val="List Continue 2"/>
     <w:basedOn w:val="Normal"/>
     <w:uiPriority w:val="99"/>
@@ -9096,7 +10792,7 @@
       <w:contextualSpacing/>
     </w:pPr>
   </w:style>
-  <w:style w:type="paragraph" w:styleId="ListContinue3">
+  <w:style w:type="paragraph" w:styleId="Continuarlista3">
     <w:name w:val="List Continue 3"/>
     <w:basedOn w:val="Normal"/>
     <w:uiPriority w:val="99"/>
@@ -9108,9 +10804,9 @@
       <w:contextualSpacing/>
     </w:pPr>
   </w:style>
-  <w:style w:type="paragraph" w:styleId="MacroText">
+  <w:style w:type="paragraph" w:styleId="Textomacro">
     <w:name w:val="macro"/>
-    <w:link w:val="MacroTextChar"/>
+    <w:link w:val="TextomacroCar"/>
     <w:uiPriority w:val="99"/>
     <w:unhideWhenUsed/>
     <w:rsid w:val="0029639D"/>
@@ -9131,10 +10827,10 @@
       <w:szCs w:val="20"/>
     </w:rPr>
   </w:style>
-  <w:style w:type="character" w:customStyle="1" w:styleId="MacroTextChar">
-    <w:name w:val="Macro Text Char"/>
-    <w:basedOn w:val="DefaultParagraphFont"/>
-    <w:link w:val="MacroText"/>
+  <w:style w:type="character" w:customStyle="1" w:styleId="TextomacroCar">
+    <w:name w:val="Texto macro Car"/>
+    <w:basedOn w:val="Fuentedeprrafopredeter"/>
+    <w:link w:val="Textomacro"/>
     <w:uiPriority w:val="99"/>
     <w:rsid w:val="0029639D"/>
     <w:rPr>
@@ -9143,11 +10839,11 @@
       <w:szCs w:val="20"/>
     </w:rPr>
   </w:style>
-  <w:style w:type="paragraph" w:styleId="Quote">
+  <w:style w:type="paragraph" w:styleId="Cita">
     <w:name w:val="Quote"/>
     <w:basedOn w:val="Normal"/>
     <w:next w:val="Normal"/>
-    <w:link w:val="QuoteChar"/>
+    <w:link w:val="CitaCar"/>
     <w:uiPriority w:val="29"/>
     <w:qFormat/>
     <w:rsid w:val="00FC693F"/>
@@ -9157,10 +10853,10 @@
       <w:color w:val="000000" w:themeColor="text1"/>
     </w:rPr>
   </w:style>
-  <w:style w:type="character" w:customStyle="1" w:styleId="QuoteChar">
-    <w:name w:val="Quote Char"/>
-    <w:basedOn w:val="DefaultParagraphFont"/>
-    <w:link w:val="Quote"/>
+  <w:style w:type="character" w:customStyle="1" w:styleId="CitaCar">
+    <w:name w:val="Cita Car"/>
+    <w:basedOn w:val="Fuentedeprrafopredeter"/>
+    <w:link w:val="Cita"/>
     <w:uiPriority w:val="29"/>
     <w:rsid w:val="00FC693F"/>
     <w:rPr>
@@ -9169,10 +10865,10 @@
       <w:color w:val="000000" w:themeColor="text1"/>
     </w:rPr>
   </w:style>
-  <w:style w:type="character" w:customStyle="1" w:styleId="Heading4Char">
-    <w:name w:val="Heading 4 Char"/>
-    <w:basedOn w:val="DefaultParagraphFont"/>
-    <w:link w:val="Heading4"/>
+  <w:style w:type="character" w:customStyle="1" w:styleId="Ttulo4Car">
+    <w:name w:val="Título 4 Car"/>
+    <w:basedOn w:val="Fuentedeprrafopredeter"/>
+    <w:link w:val="Ttulo4"/>
     <w:uiPriority w:val="9"/>
     <w:semiHidden/>
     <w:rsid w:val="00FC693F"/>
@@ -9185,10 +10881,10 @@
       <w:color w:val="4F81BD" w:themeColor="accent1"/>
     </w:rPr>
   </w:style>
-  <w:style w:type="character" w:customStyle="1" w:styleId="Heading5Char">
-    <w:name w:val="Heading 5 Char"/>
-    <w:basedOn w:val="DefaultParagraphFont"/>
-    <w:link w:val="Heading5"/>
+  <w:style w:type="character" w:customStyle="1" w:styleId="Ttulo5Car">
+    <w:name w:val="Título 5 Car"/>
+    <w:basedOn w:val="Fuentedeprrafopredeter"/>
+    <w:link w:val="Ttulo5"/>
     <w:uiPriority w:val="9"/>
     <w:semiHidden/>
     <w:rsid w:val="00FC693F"/>
@@ -9197,10 +10893,10 @@
       <w:color w:val="243F60" w:themeColor="accent1" w:themeShade="7F"/>
     </w:rPr>
   </w:style>
-  <w:style w:type="character" w:customStyle="1" w:styleId="Heading6Char">
-    <w:name w:val="Heading 6 Char"/>
-    <w:basedOn w:val="DefaultParagraphFont"/>
-    <w:link w:val="Heading6"/>
+  <w:style w:type="character" w:customStyle="1" w:styleId="Ttulo6Car">
+    <w:name w:val="Título 6 Car"/>
+    <w:basedOn w:val="Fuentedeprrafopredeter"/>
+    <w:link w:val="Ttulo6"/>
     <w:uiPriority w:val="9"/>
     <w:semiHidden/>
     <w:rsid w:val="00FC693F"/>
@@ -9211,10 +10907,10 @@
       <w:color w:val="243F60" w:themeColor="accent1" w:themeShade="7F"/>
     </w:rPr>
   </w:style>
-  <w:style w:type="character" w:customStyle="1" w:styleId="Heading7Char">
-    <w:name w:val="Heading 7 Char"/>
-    <w:basedOn w:val="DefaultParagraphFont"/>
-    <w:link w:val="Heading7"/>
+  <w:style w:type="character" w:customStyle="1" w:styleId="Ttulo7Car">
+    <w:name w:val="Título 7 Car"/>
+    <w:basedOn w:val="Fuentedeprrafopredeter"/>
+    <w:link w:val="Ttulo7"/>
     <w:uiPriority w:val="9"/>
     <w:semiHidden/>
     <w:rsid w:val="00FC693F"/>
@@ -9225,10 +10921,10 @@
       <w:color w:val="404040" w:themeColor="text1" w:themeTint="BF"/>
     </w:rPr>
   </w:style>
-  <w:style w:type="character" w:customStyle="1" w:styleId="Heading8Char">
-    <w:name w:val="Heading 8 Char"/>
-    <w:basedOn w:val="DefaultParagraphFont"/>
-    <w:link w:val="Heading8"/>
+  <w:style w:type="character" w:customStyle="1" w:styleId="Ttulo8Car">
+    <w:name w:val="Título 8 Car"/>
+    <w:basedOn w:val="Fuentedeprrafopredeter"/>
+    <w:link w:val="Ttulo8"/>
     <w:uiPriority w:val="9"/>
     <w:semiHidden/>
     <w:rsid w:val="00FC693F"/>
@@ -9239,10 +10935,10 @@
       <w:szCs w:val="20"/>
     </w:rPr>
   </w:style>
-  <w:style w:type="character" w:customStyle="1" w:styleId="Heading9Char">
-    <w:name w:val="Heading 9 Char"/>
-    <w:basedOn w:val="DefaultParagraphFont"/>
-    <w:link w:val="Heading9"/>
+  <w:style w:type="character" w:customStyle="1" w:styleId="Ttulo9Car">
+    <w:name w:val="Título 9 Car"/>
+    <w:basedOn w:val="Fuentedeprrafopredeter"/>
+    <w:link w:val="Ttulo9"/>
     <w:uiPriority w:val="9"/>
     <w:semiHidden/>
     <w:rsid w:val="00FC693F"/>
@@ -9255,7 +10951,7 @@
       <w:szCs w:val="20"/>
     </w:rPr>
   </w:style>
-  <w:style w:type="paragraph" w:styleId="Caption">
+  <w:style w:type="paragraph" w:styleId="Descripcin">
     <w:name w:val="caption"/>
     <w:basedOn w:val="Normal"/>
     <w:next w:val="Normal"/>
@@ -9275,9 +10971,9 @@
       <w:szCs w:val="18"/>
     </w:rPr>
   </w:style>
-  <w:style w:type="character" w:styleId="Strong">
+  <w:style w:type="character" w:styleId="Fuerte">
     <w:name w:val="Strong"/>
-    <w:basedOn w:val="DefaultParagraphFont"/>
+    <w:basedOn w:val="Fuentedeprrafopredeter"/>
     <w:uiPriority w:val="22"/>
     <w:qFormat/>
     <w:rsid w:val="00FC693F"/>
@@ -9286,9 +10982,9 @@
       <w:bCs/>
     </w:rPr>
   </w:style>
-  <w:style w:type="character" w:styleId="Emphasis">
+  <w:style w:type="character" w:styleId="nfasis">
     <w:name w:val="Emphasis"/>
-    <w:basedOn w:val="DefaultParagraphFont"/>
+    <w:basedOn w:val="Fuentedeprrafopredeter"/>
     <w:uiPriority w:val="20"/>
     <w:qFormat/>
     <w:rsid w:val="00FC693F"/>
@@ -9297,11 +10993,11 @@
       <w:iCs/>
     </w:rPr>
   </w:style>
-  <w:style w:type="paragraph" w:styleId="IntenseQuote">
+  <w:style w:type="paragraph" w:styleId="Citadestacada">
     <w:name w:val="Intense Quote"/>
     <w:basedOn w:val="Normal"/>
     <w:next w:val="Normal"/>
-    <w:link w:val="IntenseQuoteChar"/>
+    <w:link w:val="CitadestacadaCar"/>
     <w:uiPriority w:val="30"/>
     <w:qFormat/>
     <w:rsid w:val="00FC693F"/>
@@ -9320,10 +11016,10 @@
       <w:color w:val="4F81BD" w:themeColor="accent1"/>
     </w:rPr>
   </w:style>
-  <w:style w:type="character" w:customStyle="1" w:styleId="IntenseQuoteChar">
-    <w:name w:val="Intense Quote Char"/>
-    <w:basedOn w:val="DefaultParagraphFont"/>
-    <w:link w:val="IntenseQuote"/>
+  <w:style w:type="character" w:customStyle="1" w:styleId="CitadestacadaCar">
+    <w:name w:val="Cita destacada Car"/>
+    <w:basedOn w:val="Fuentedeprrafopredeter"/>
+    <w:link w:val="Citadestacada"/>
     <w:uiPriority w:val="30"/>
     <w:rsid w:val="00FC693F"/>
     <w:rPr>
@@ -9334,9 +11030,9 @@
       <w:color w:val="4F81BD" w:themeColor="accent1"/>
     </w:rPr>
   </w:style>
-  <w:style w:type="character" w:styleId="SubtleEmphasis">
+  <w:style w:type="character" w:styleId="nfasissutil">
     <w:name w:val="Subtle Emphasis"/>
-    <w:basedOn w:val="DefaultParagraphFont"/>
+    <w:basedOn w:val="Fuentedeprrafopredeter"/>
     <w:uiPriority w:val="19"/>
     <w:qFormat/>
     <w:rsid w:val="00FC693F"/>
@@ -9346,9 +11042,9 @@
       <w:color w:val="808080" w:themeColor="text1" w:themeTint="7F"/>
     </w:rPr>
   </w:style>
-  <w:style w:type="character" w:styleId="IntenseEmphasis">
+  <w:style w:type="character" w:styleId="nfasisintenso">
     <w:name w:val="Intense Emphasis"/>
-    <w:basedOn w:val="DefaultParagraphFont"/>
+    <w:basedOn w:val="Fuentedeprrafopredeter"/>
     <w:uiPriority w:val="21"/>
     <w:qFormat/>
     <w:rsid w:val="00FC693F"/>
@@ -9360,9 +11056,9 @@
       <w:color w:val="4F81BD" w:themeColor="accent1"/>
     </w:rPr>
   </w:style>
-  <w:style w:type="character" w:styleId="SubtleReference">
+  <w:style w:type="character" w:styleId="Referenciasutil">
     <w:name w:val="Subtle Reference"/>
-    <w:basedOn w:val="DefaultParagraphFont"/>
+    <w:basedOn w:val="Fuentedeprrafopredeter"/>
     <w:uiPriority w:val="31"/>
     <w:qFormat/>
     <w:rsid w:val="00FC693F"/>
@@ -9372,9 +11068,9 @@
       <w:u w:val="single"/>
     </w:rPr>
   </w:style>
-  <w:style w:type="character" w:styleId="IntenseReference">
+  <w:style w:type="character" w:styleId="Referenciaintensa">
     <w:name w:val="Intense Reference"/>
-    <w:basedOn w:val="DefaultParagraphFont"/>
+    <w:basedOn w:val="Fuentedeprrafopredeter"/>
     <w:uiPriority w:val="32"/>
     <w:qFormat/>
     <w:rsid w:val="00FC693F"/>
@@ -9387,9 +11083,9 @@
       <w:u w:val="single"/>
     </w:rPr>
   </w:style>
-  <w:style w:type="character" w:styleId="BookTitle">
+  <w:style w:type="character" w:styleId="Ttulodellibro">
     <w:name w:val="Book Title"/>
-    <w:basedOn w:val="DefaultParagraphFont"/>
+    <w:basedOn w:val="Fuentedeprrafopredeter"/>
     <w:uiPriority w:val="33"/>
     <w:qFormat/>
     <w:rsid w:val="00FC693F"/>
@@ -9400,9 +11096,9 @@
       <w:spacing w:val="5"/>
     </w:rPr>
   </w:style>
-  <w:style w:type="paragraph" w:styleId="TOCHeading">
+  <w:style w:type="paragraph" w:styleId="TtuloTDC">
     <w:name w:val="TOC Heading"/>
-    <w:basedOn w:val="Heading1"/>
+    <w:basedOn w:val="Ttulo1"/>
     <w:next w:val="Normal"/>
     <w:uiPriority w:val="39"/>
     <w:semiHidden/>
@@ -9413,9 +11109,9 @@
       <w:outlineLvl w:val="9"/>
     </w:pPr>
   </w:style>
-  <w:style w:type="table" w:styleId="TableGrid">
+  <w:style w:type="table" w:styleId="Tablaconcuadrcula">
     <w:name w:val="Table Grid"/>
-    <w:basedOn w:val="TableNormal"/>
+    <w:basedOn w:val="Tablanormal"/>
     <w:uiPriority w:val="59"/>
     <w:rsid w:val="00FC693F"/>
     <w:pPr>
@@ -9432,9 +11128,9 @@
       </w:tblBorders>
     </w:tblPr>
   </w:style>
-  <w:style w:type="table" w:styleId="LightShading">
+  <w:style w:type="table" w:styleId="Sombreadoclaro">
     <w:name w:val="Light Shading"/>
-    <w:basedOn w:val="TableNormal"/>
+    <w:basedOn w:val="Tablanormal"/>
     <w:uiPriority w:val="60"/>
     <w:rsid w:val="00FC693F"/>
     <w:pPr>
@@ -9528,9 +11224,9 @@
       </w:tcPr>
     </w:tblStylePr>
   </w:style>
-  <w:style w:type="table" w:styleId="LightShading-Accent1">
+  <w:style w:type="table" w:styleId="Sombreadoclaro-nfasis1">
     <w:name w:val="Light Shading Accent 1"/>
-    <w:basedOn w:val="TableNormal"/>
+    <w:basedOn w:val="Tablanormal"/>
     <w:uiPriority w:val="60"/>
     <w:rsid w:val="00FC693F"/>
     <w:pPr>
@@ -9624,9 +11320,9 @@
       </w:tcPr>
     </w:tblStylePr>
   </w:style>
-  <w:style w:type="table" w:styleId="LightShading-Accent2">
+  <w:style w:type="table" w:styleId="Sombreadoclaro-nfasis2">
     <w:name w:val="Light Shading Accent 2"/>
-    <w:basedOn w:val="TableNormal"/>
+    <w:basedOn w:val="Tablanormal"/>
     <w:uiPriority w:val="60"/>
     <w:rsid w:val="00FC693F"/>
     <w:pPr>
@@ -9720,9 +11416,9 @@
       </w:tcPr>
     </w:tblStylePr>
   </w:style>
-  <w:style w:type="table" w:styleId="LightShading-Accent3">
+  <w:style w:type="table" w:styleId="Sombreadoclaro-nfasis3">
     <w:name w:val="Light Shading Accent 3"/>
-    <w:basedOn w:val="TableNormal"/>
+    <w:basedOn w:val="Tablanormal"/>
     <w:uiPriority w:val="60"/>
     <w:rsid w:val="00FC693F"/>
     <w:pPr>
@@ -9816,9 +11512,9 @@
       </w:tcPr>
     </w:tblStylePr>
   </w:style>
-  <w:style w:type="table" w:styleId="LightShading-Accent4">
+  <w:style w:type="table" w:styleId="Sombreadoclaro-nfasis4">
     <w:name w:val="Light Shading Accent 4"/>
-    <w:basedOn w:val="TableNormal"/>
+    <w:basedOn w:val="Tablanormal"/>
     <w:uiPriority w:val="60"/>
     <w:rsid w:val="00FC693F"/>
     <w:pPr>
@@ -9912,9 +11608,9 @@
       </w:tcPr>
     </w:tblStylePr>
   </w:style>
-  <w:style w:type="table" w:styleId="LightShading-Accent5">
+  <w:style w:type="table" w:styleId="Sombreadoclaro-nfasis5">
     <w:name w:val="Light Shading Accent 5"/>
-    <w:basedOn w:val="TableNormal"/>
+    <w:basedOn w:val="Tablanormal"/>
     <w:uiPriority w:val="60"/>
     <w:rsid w:val="00FC693F"/>
     <w:pPr>
@@ -10008,9 +11704,9 @@
       </w:tcPr>
     </w:tblStylePr>
   </w:style>
-  <w:style w:type="table" w:styleId="LightShading-Accent6">
+  <w:style w:type="table" w:styleId="Sombreadoclaro-nfasis6">
     <w:name w:val="Light Shading Accent 6"/>
-    <w:basedOn w:val="TableNormal"/>
+    <w:basedOn w:val="Tablanormal"/>
     <w:uiPriority w:val="60"/>
     <w:rsid w:val="00FC693F"/>
     <w:pPr>
@@ -10104,9 +11800,9 @@
       </w:tcPr>
     </w:tblStylePr>
   </w:style>
-  <w:style w:type="table" w:styleId="LightList">
+  <w:style w:type="table" w:styleId="Listaclara">
     <w:name w:val="Light List"/>
-    <w:basedOn w:val="TableNormal"/>
+    <w:basedOn w:val="Tablanormal"/>
     <w:uiPriority w:val="61"/>
     <w:rsid w:val="00FC693F"/>
     <w:pPr>
@@ -10189,9 +11885,9 @@
       </w:tcPr>
     </w:tblStylePr>
   </w:style>
-  <w:style w:type="table" w:styleId="LightList-Accent1">
+  <w:style w:type="table" w:styleId="Listaclara-nfasis1">
     <w:name w:val="Light List Accent 1"/>
-    <w:basedOn w:val="TableNormal"/>
+    <w:basedOn w:val="Tablanormal"/>
     <w:uiPriority w:val="61"/>
     <w:rsid w:val="00FC693F"/>
     <w:pPr>
@@ -10274,9 +11970,9 @@
       </w:tcPr>
     </w:tblStylePr>
   </w:style>
-  <w:style w:type="table" w:styleId="LightList-Accent2">
+  <w:style w:type="table" w:styleId="Listaclara-nfasis2">
     <w:name w:val="Light List Accent 2"/>
-    <w:basedOn w:val="TableNormal"/>
+    <w:basedOn w:val="Tablanormal"/>
     <w:uiPriority w:val="61"/>
     <w:rsid w:val="00CB0664"/>
     <w:pPr>
@@ -10359,9 +12055,9 @@
       </w:tcPr>
     </w:tblStylePr>
   </w:style>
-  <w:style w:type="table" w:styleId="LightList-Accent3">
+  <w:style w:type="table" w:styleId="Listaclara-nfasis3">
     <w:name w:val="Light List Accent 3"/>
-    <w:basedOn w:val="TableNormal"/>
+    <w:basedOn w:val="Tablanormal"/>
     <w:uiPriority w:val="61"/>
     <w:rsid w:val="00CB0664"/>
     <w:pPr>
@@ -10444,9 +12140,9 @@
       </w:tcPr>
     </w:tblStylePr>
   </w:style>
-  <w:style w:type="table" w:styleId="LightList-Accent4">
+  <w:style w:type="table" w:styleId="Listaclara-nfasis4">
     <w:name w:val="Light List Accent 4"/>
-    <w:basedOn w:val="TableNormal"/>
+    <w:basedOn w:val="Tablanormal"/>
     <w:uiPriority w:val="61"/>
     <w:rsid w:val="00CB0664"/>
     <w:pPr>
@@ -10529,9 +12225,9 @@
       </w:tcPr>
     </w:tblStylePr>
   </w:style>
-  <w:style w:type="table" w:styleId="LightList-Accent5">
+  <w:style w:type="table" w:styleId="Listaclara-nfasis5">
     <w:name w:val="Light List Accent 5"/>
-    <w:basedOn w:val="TableNormal"/>
+    <w:basedOn w:val="Tablanormal"/>
     <w:uiPriority w:val="61"/>
     <w:rsid w:val="00CB0664"/>
     <w:pPr>
@@ -10614,9 +12310,9 @@
       </w:tcPr>
     </w:tblStylePr>
   </w:style>
-  <w:style w:type="table" w:styleId="LightList-Accent6">
+  <w:style w:type="table" w:styleId="Listaclara-nfasis6">
     <w:name w:val="Light List Accent 6"/>
-    <w:basedOn w:val="TableNormal"/>
+    <w:basedOn w:val="Tablanormal"/>
     <w:uiPriority w:val="61"/>
     <w:rsid w:val="00CB0664"/>
     <w:pPr>
@@ -10699,9 +12395,9 @@
       </w:tcPr>
     </w:tblStylePr>
   </w:style>
-  <w:style w:type="table" w:styleId="LightGrid">
+  <w:style w:type="table" w:styleId="Cuadrculaclara">
     <w:name w:val="Light Grid"/>
-    <w:basedOn w:val="TableNormal"/>
+    <w:basedOn w:val="Tablanormal"/>
     <w:uiPriority w:val="62"/>
     <w:rsid w:val="00CB0664"/>
     <w:pPr>
@@ -10822,9 +12518,9 @@
       </w:tcPr>
     </w:tblStylePr>
   </w:style>
-  <w:style w:type="table" w:styleId="LightGrid-Accent1">
+  <w:style w:type="table" w:styleId="Cuadrculaclara-nfasis1">
     <w:name w:val="Light Grid Accent 1"/>
-    <w:basedOn w:val="TableNormal"/>
+    <w:basedOn w:val="Tablanormal"/>
     <w:uiPriority w:val="62"/>
     <w:rsid w:val="00CB0664"/>
     <w:pPr>
@@ -10945,9 +12641,9 @@
       </w:tcPr>
     </w:tblStylePr>
   </w:style>
-  <w:style w:type="table" w:styleId="LightGrid-Accent2">
+  <w:style w:type="table" w:styleId="Cuadrculaclara-nfasis2">
     <w:name w:val="Light Grid Accent 2"/>
-    <w:basedOn w:val="TableNormal"/>
+    <w:basedOn w:val="Tablanormal"/>
     <w:uiPriority w:val="62"/>
     <w:rsid w:val="00CB0664"/>
     <w:pPr>
@@ -11068,9 +12764,9 @@
       </w:tcPr>
     </w:tblStylePr>
   </w:style>
-  <w:style w:type="table" w:styleId="LightGrid-Accent3">
+  <w:style w:type="table" w:styleId="Cuadrculaclara-nfasis3">
     <w:name w:val="Light Grid Accent 3"/>
-    <w:basedOn w:val="TableNormal"/>
+    <w:basedOn w:val="Tablanormal"/>
     <w:uiPriority w:val="62"/>
     <w:rsid w:val="00CB0664"/>
     <w:pPr>
@@ -11191,9 +12887,9 @@
       </w:tcPr>
     </w:tblStylePr>
   </w:style>
-  <w:style w:type="table" w:styleId="LightGrid-Accent4">
+  <w:style w:type="table" w:styleId="Cuadrculaclara-nfasis4">
     <w:name w:val="Light Grid Accent 4"/>
-    <w:basedOn w:val="TableNormal"/>
+    <w:basedOn w:val="Tablanormal"/>
     <w:uiPriority w:val="62"/>
     <w:rsid w:val="00CB0664"/>
     <w:pPr>
@@ -11314,9 +13010,9 @@
       </w:tcPr>
     </w:tblStylePr>
   </w:style>
-  <w:style w:type="table" w:styleId="LightGrid-Accent5">
+  <w:style w:type="table" w:styleId="Cuadrculaclara-nfasis5">
     <w:name w:val="Light Grid Accent 5"/>
-    <w:basedOn w:val="TableNormal"/>
+    <w:basedOn w:val="Tablanormal"/>
     <w:uiPriority w:val="62"/>
     <w:rsid w:val="00CB0664"/>
     <w:pPr>
@@ -11437,9 +13133,9 @@
       </w:tcPr>
     </w:tblStylePr>
   </w:style>
-  <w:style w:type="table" w:styleId="LightGrid-Accent6">
+  <w:style w:type="table" w:styleId="Cuadrculaclara-nfasis6">
     <w:name w:val="Light Grid Accent 6"/>
-    <w:basedOn w:val="TableNormal"/>
+    <w:basedOn w:val="Tablanormal"/>
     <w:uiPriority w:val="62"/>
     <w:rsid w:val="00CB0664"/>
     <w:pPr>
@@ -11560,9 +13256,9 @@
       </w:tcPr>
     </w:tblStylePr>
   </w:style>
-  <w:style w:type="table" w:styleId="MediumShading1">
+  <w:style w:type="table" w:styleId="Sombreadomedio1">
     <w:name w:val="Medium Shading 1"/>
-    <w:basedOn w:val="TableNormal"/>
+    <w:basedOn w:val="Tablanormal"/>
     <w:uiPriority w:val="63"/>
     <w:rsid w:val="00CB0664"/>
     <w:pPr>
@@ -11659,9 +13355,9 @@
       </w:tcPr>
     </w:tblStylePr>
   </w:style>
-  <w:style w:type="table" w:styleId="MediumShading1-Accent1">
+  <w:style w:type="table" w:styleId="Sombreadomedio1-nfasis1">
     <w:name w:val="Medium Shading 1 Accent 1"/>
-    <w:basedOn w:val="TableNormal"/>
+    <w:basedOn w:val="Tablanormal"/>
     <w:uiPriority w:val="63"/>
     <w:rsid w:val="00CB0664"/>
     <w:pPr>
@@ -11758,9 +13454,9 @@
       </w:tcPr>
     </w:tblStylePr>
   </w:style>
-  <w:style w:type="table" w:styleId="MediumShading1-Accent2">
+  <w:style w:type="table" w:styleId="Sombreadomedio1-nfasis2">
     <w:name w:val="Medium Shading 1 Accent 2"/>
-    <w:basedOn w:val="TableNormal"/>
+    <w:basedOn w:val="Tablanormal"/>
     <w:uiPriority w:val="63"/>
     <w:rsid w:val="00CB0664"/>
     <w:pPr>
@@ -11857,9 +13553,9 @@
       </w:tcPr>
     </w:tblStylePr>
   </w:style>
-  <w:style w:type="table" w:styleId="MediumShading1-Accent3">
+  <w:style w:type="table" w:styleId="Sombreadomedio1-nfasis3">
     <w:name w:val="Medium Shading 1 Accent 3"/>
-    <w:basedOn w:val="TableNormal"/>
+    <w:basedOn w:val="Tablanormal"/>
     <w:uiPriority w:val="63"/>
     <w:rsid w:val="00CB0664"/>
     <w:pPr>
@@ -11956,9 +13652,9 @@
       </w:tcPr>
     </w:tblStylePr>
   </w:style>
-  <w:style w:type="table" w:styleId="MediumShading1-Accent4">
+  <w:style w:type="table" w:styleId="Sombreadomedio1-nfasis4">
     <w:name w:val="Medium Shading 1 Accent 4"/>
-    <w:basedOn w:val="TableNormal"/>
+    <w:basedOn w:val="Tablanormal"/>
     <w:uiPriority w:val="63"/>
     <w:rsid w:val="00CB0664"/>
     <w:pPr>
@@ -12055,9 +13751,9 @@
       </w:tcPr>
     </w:tblStylePr>
   </w:style>
-  <w:style w:type="table" w:styleId="MediumShading1-Accent5">
+  <w:style w:type="table" w:styleId="Sombreadomedio1-nfasis5">
     <w:name w:val="Medium Shading 1 Accent 5"/>
-    <w:basedOn w:val="TableNormal"/>
+    <w:basedOn w:val="Tablanormal"/>
     <w:uiPriority w:val="63"/>
     <w:rsid w:val="00CB0664"/>
     <w:pPr>
@@ -12154,9 +13850,9 @@
       </w:tcPr>
     </w:tblStylePr>
   </w:style>
-  <w:style w:type="table" w:styleId="MediumShading1-Accent6">
+  <w:style w:type="table" w:styleId="Sombreadomedio1-nfasis6">
     <w:name w:val="Medium Shading 1 Accent 6"/>
-    <w:basedOn w:val="TableNormal"/>
+    <w:basedOn w:val="Tablanormal"/>
     <w:uiPriority w:val="63"/>
     <w:rsid w:val="00CB0664"/>
     <w:pPr>
@@ -12253,9 +13949,9 @@
       </w:tcPr>
     </w:tblStylePr>
   </w:style>
-  <w:style w:type="table" w:styleId="MediumShading2">
+  <w:style w:type="table" w:styleId="Sombreadomedio2">
     <w:name w:val="Medium Shading 2"/>
-    <w:basedOn w:val="TableNormal"/>
+    <w:basedOn w:val="Tablanormal"/>
     <w:uiPriority w:val="64"/>
     <w:rsid w:val="00CB0664"/>
     <w:pPr>
@@ -12395,9 +14091,9 @@
       </w:tcPr>
     </w:tblStylePr>
   </w:style>
-  <w:style w:type="table" w:styleId="MediumShading2-Accent1">
+  <w:style w:type="table" w:styleId="Sombreadomedio2-nfasis1">
     <w:name w:val="Medium Shading 2 Accent 1"/>
-    <w:basedOn w:val="TableNormal"/>
+    <w:basedOn w:val="Tablanormal"/>
     <w:uiPriority w:val="64"/>
     <w:rsid w:val="00CB0664"/>
     <w:pPr>
@@ -12537,9 +14233,9 @@
       </w:tcPr>
     </w:tblStylePr>
   </w:style>
-  <w:style w:type="table" w:styleId="MediumShading2-Accent2">
+  <w:style w:type="table" w:styleId="Sombreadomedio2-nfasis2">
     <w:name w:val="Medium Shading 2 Accent 2"/>
-    <w:basedOn w:val="TableNormal"/>
+    <w:basedOn w:val="Tablanormal"/>
     <w:uiPriority w:val="64"/>
     <w:rsid w:val="00CB0664"/>
     <w:pPr>
@@ -12679,9 +14375,9 @@
       </w:tcPr>
     </w:tblStylePr>
   </w:style>
-  <w:style w:type="table" w:styleId="MediumShading2-Accent3">
+  <w:style w:type="table" w:styleId="Sombreadomedio2-nfasis3">
     <w:name w:val="Medium Shading 2 Accent 3"/>
-    <w:basedOn w:val="TableNormal"/>
+    <w:basedOn w:val="Tablanormal"/>
     <w:uiPriority w:val="64"/>
     <w:rsid w:val="00CB0664"/>
     <w:pPr>
@@ -12821,9 +14517,9 @@
       </w:tcPr>
     </w:tblStylePr>
   </w:style>
-  <w:style w:type="table" w:styleId="MediumShading2-Accent4">
+  <w:style w:type="table" w:styleId="Sombreadomedio2-nfasis4">
     <w:name w:val="Medium Shading 2 Accent 4"/>
-    <w:basedOn w:val="TableNormal"/>
+    <w:basedOn w:val="Tablanormal"/>
     <w:uiPriority w:val="64"/>
     <w:rsid w:val="00CB0664"/>
     <w:pPr>
@@ -12963,9 +14659,9 @@
       </w:tcPr>
     </w:tblStylePr>
   </w:style>
-  <w:style w:type="table" w:styleId="MediumShading2-Accent5">
+  <w:style w:type="table" w:styleId="Sombreadomedio2-nfasis5">
     <w:name w:val="Medium Shading 2 Accent 5"/>
-    <w:basedOn w:val="TableNormal"/>
+    <w:basedOn w:val="Tablanormal"/>
     <w:uiPriority w:val="64"/>
     <w:rsid w:val="00CB0664"/>
     <w:pPr>
@@ -13105,9 +14801,9 @@
       </w:tcPr>
     </w:tblStylePr>
   </w:style>
-  <w:style w:type="table" w:styleId="MediumShading2-Accent6">
+  <w:style w:type="table" w:styleId="Sombreadomedio2-nfasis6">
     <w:name w:val="Medium Shading 2 Accent 6"/>
-    <w:basedOn w:val="TableNormal"/>
+    <w:basedOn w:val="Tablanormal"/>
     <w:uiPriority w:val="64"/>
     <w:rsid w:val="00CB0664"/>
     <w:pPr>
@@ -13247,9 +14943,9 @@
       </w:tcPr>
     </w:tblStylePr>
   </w:style>
-  <w:style w:type="table" w:styleId="MediumList1">
+  <w:style w:type="table" w:styleId="Listamedia1">
     <w:name w:val="Medium List 1"/>
-    <w:basedOn w:val="TableNormal"/>
+    <w:basedOn w:val="Tablanormal"/>
     <w:uiPriority w:val="65"/>
     <w:rsid w:val="00CB0664"/>
     <w:pPr>
@@ -13324,9 +15020,9 @@
       </w:tcPr>
     </w:tblStylePr>
   </w:style>
-  <w:style w:type="table" w:styleId="MediumList1-Accent1">
+  <w:style w:type="table" w:styleId="Listamedia1-nfasis1">
     <w:name w:val="Medium List 1 Accent 1"/>
-    <w:basedOn w:val="TableNormal"/>
+    <w:basedOn w:val="Tablanormal"/>
     <w:uiPriority w:val="65"/>
     <w:rsid w:val="00CB0664"/>
     <w:pPr>
@@ -13401,9 +15097,9 @@
       </w:tcPr>
     </w:tblStylePr>
   </w:style>
-  <w:style w:type="table" w:styleId="MediumList1-Accent2">
+  <w:style w:type="table" w:styleId="Listamedia1-nfasis2">
     <w:name w:val="Medium List 1 Accent 2"/>
-    <w:basedOn w:val="TableNormal"/>
+    <w:basedOn w:val="Tablanormal"/>
     <w:uiPriority w:val="65"/>
     <w:rsid w:val="00CB0664"/>
     <w:pPr>
@@ -13478,9 +15174,9 @@
       </w:tcPr>
     </w:tblStylePr>
   </w:style>
-  <w:style w:type="table" w:styleId="MediumList1-Accent3">
+  <w:style w:type="table" w:styleId="Listamedia1-nfasis3">
     <w:name w:val="Medium List 1 Accent 3"/>
-    <w:basedOn w:val="TableNormal"/>
+    <w:basedOn w:val="Tablanormal"/>
     <w:uiPriority w:val="65"/>
     <w:rsid w:val="00CB0664"/>
     <w:pPr>
@@ -13555,9 +15251,9 @@
       </w:tcPr>
     </w:tblStylePr>
   </w:style>
-  <w:style w:type="table" w:styleId="MediumList1-Accent4">
+  <w:style w:type="table" w:styleId="Listamedia1-nfasis4">
     <w:name w:val="Medium List 1 Accent 4"/>
-    <w:basedOn w:val="TableNormal"/>
+    <w:basedOn w:val="Tablanormal"/>
     <w:uiPriority w:val="65"/>
     <w:rsid w:val="00CB0664"/>
     <w:pPr>
@@ -13632,9 +15328,9 @@
       </w:tcPr>
     </w:tblStylePr>
   </w:style>
-  <w:style w:type="table" w:styleId="MediumList1-Accent5">
+  <w:style w:type="table" w:styleId="Listamedia1-nfasis5">
     <w:name w:val="Medium List 1 Accent 5"/>
-    <w:basedOn w:val="TableNormal"/>
+    <w:basedOn w:val="Tablanormal"/>
     <w:uiPriority w:val="65"/>
     <w:rsid w:val="00CB0664"/>
     <w:pPr>
@@ -13709,9 +15405,9 @@
       </w:tcPr>
     </w:tblStylePr>
   </w:style>
-  <w:style w:type="table" w:styleId="MediumList1-Accent6">
+  <w:style w:type="table" w:styleId="Listamedia1-nfasis6">
     <w:name w:val="Medium List 1 Accent 6"/>
-    <w:basedOn w:val="TableNormal"/>
+    <w:basedOn w:val="Tablanormal"/>
     <w:uiPriority w:val="65"/>
     <w:rsid w:val="00CB0664"/>
     <w:pPr>
@@ -13786,9 +15482,9 @@
       </w:tcPr>
     </w:tblStylePr>
   </w:style>
-  <w:style w:type="table" w:styleId="MediumList2">
+  <w:style w:type="table" w:styleId="Listamedia2">
     <w:name w:val="Medium List 2"/>
-    <w:basedOn w:val="TableNormal"/>
+    <w:basedOn w:val="Tablanormal"/>
     <w:uiPriority w:val="66"/>
     <w:rsid w:val="00CB0664"/>
     <w:pPr>
@@ -13907,9 +15603,9 @@
       </w:tcPr>
     </w:tblStylePr>
   </w:style>
-  <w:style w:type="table" w:styleId="MediumList2-Accent1">
+  <w:style w:type="table" w:styleId="Listamedia2-nfasis1">
     <w:name w:val="Medium List 2 Accent 1"/>
-    <w:basedOn w:val="TableNormal"/>
+    <w:basedOn w:val="Tablanormal"/>
     <w:uiPriority w:val="66"/>
     <w:rsid w:val="00CB0664"/>
     <w:pPr>
@@ -14028,9 +15724,9 @@
       </w:tcPr>
     </w:tblStylePr>
   </w:style>
-  <w:style w:type="table" w:styleId="MediumList2-Accent2">
+  <w:style w:type="table" w:styleId="Listamedia2-nfasis2">
     <w:name w:val="Medium List 2 Accent 2"/>
-    <w:basedOn w:val="TableNormal"/>
+    <w:basedOn w:val="Tablanormal"/>
     <w:uiPriority w:val="66"/>
     <w:rsid w:val="00CB0664"/>
     <w:pPr>
@@ -14149,9 +15845,9 @@
       </w:tcPr>
     </w:tblStylePr>
   </w:style>
-  <w:style w:type="table" w:styleId="MediumList2-Accent3">
+  <w:style w:type="table" w:styleId="Listamedia2-nfasis3">
     <w:name w:val="Medium List 2 Accent 3"/>
-    <w:basedOn w:val="TableNormal"/>
+    <w:basedOn w:val="Tablanormal"/>
     <w:uiPriority w:val="66"/>
     <w:rsid w:val="00CB0664"/>
     <w:pPr>
@@ -14270,9 +15966,9 @@
       </w:tcPr>
     </w:tblStylePr>
   </w:style>
-  <w:style w:type="table" w:styleId="MediumList2-Accent4">
+  <w:style w:type="table" w:styleId="Listamedia2-nfasis4">
     <w:name w:val="Medium List 2 Accent 4"/>
-    <w:basedOn w:val="TableNormal"/>
+    <w:basedOn w:val="Tablanormal"/>
     <w:uiPriority w:val="66"/>
     <w:rsid w:val="00CB0664"/>
     <w:pPr>
@@ -14391,9 +16087,9 @@
       </w:tcPr>
     </w:tblStylePr>
   </w:style>
-  <w:style w:type="table" w:styleId="MediumList2-Accent5">
+  <w:style w:type="table" w:styleId="Listamedia2-nfasis5">
     <w:name w:val="Medium List 2 Accent 5"/>
-    <w:basedOn w:val="TableNormal"/>
+    <w:basedOn w:val="Tablanormal"/>
     <w:uiPriority w:val="66"/>
     <w:rsid w:val="00CB0664"/>
     <w:pPr>
@@ -14512,9 +16208,9 @@
       </w:tcPr>
     </w:tblStylePr>
   </w:style>
-  <w:style w:type="table" w:styleId="MediumList2-Accent6">
+  <w:style w:type="table" w:styleId="Listamedia2-nfasis6">
     <w:name w:val="Medium List 2 Accent 6"/>
-    <w:basedOn w:val="TableNormal"/>
+    <w:basedOn w:val="Tablanormal"/>
     <w:uiPriority w:val="66"/>
     <w:rsid w:val="00CB0664"/>
     <w:pPr>
@@ -14633,9 +16329,9 @@
       </w:tcPr>
     </w:tblStylePr>
   </w:style>
-  <w:style w:type="table" w:styleId="MediumGrid1">
+  <w:style w:type="table" w:styleId="Cuadrculamedia1">
     <w:name w:val="Medium Grid 1"/>
-    <w:basedOn w:val="TableNormal"/>
+    <w:basedOn w:val="Tablanormal"/>
     <w:uiPriority w:val="67"/>
     <w:rsid w:val="00CB0664"/>
     <w:pPr>
@@ -14699,9 +16395,9 @@
       </w:tcPr>
     </w:tblStylePr>
   </w:style>
-  <w:style w:type="table" w:styleId="MediumGrid1-Accent1">
+  <w:style w:type="table" w:styleId="Cuadrculamedia1-nfasis1">
     <w:name w:val="Medium Grid 1 Accent 1"/>
-    <w:basedOn w:val="TableNormal"/>
+    <w:basedOn w:val="Tablanormal"/>
     <w:uiPriority w:val="67"/>
     <w:rsid w:val="00CB0664"/>
     <w:pPr>
@@ -14765,9 +16461,9 @@
       </w:tcPr>
     </w:tblStylePr>
   </w:style>
-  <w:style w:type="table" w:styleId="MediumGrid1-Accent2">
+  <w:style w:type="table" w:styleId="Cuadrculamedia1-nfasis2">
     <w:name w:val="Medium Grid 1 Accent 2"/>
-    <w:basedOn w:val="TableNormal"/>
+    <w:basedOn w:val="Tablanormal"/>
     <w:uiPriority w:val="67"/>
     <w:rsid w:val="00CB0664"/>
     <w:pPr>
@@ -14831,9 +16527,9 @@
       </w:tcPr>
     </w:tblStylePr>
   </w:style>
-  <w:style w:type="table" w:styleId="MediumGrid1-Accent3">
+  <w:style w:type="table" w:styleId="Cuadrculamedia1-nfasis3">
     <w:name w:val="Medium Grid 1 Accent 3"/>
-    <w:basedOn w:val="TableNormal"/>
+    <w:basedOn w:val="Tablanormal"/>
     <w:uiPriority w:val="67"/>
     <w:rsid w:val="00CB0664"/>
     <w:pPr>
@@ -14897,9 +16593,9 @@
       </w:tcPr>
     </w:tblStylePr>
   </w:style>
-  <w:style w:type="table" w:styleId="MediumGrid1-Accent4">
+  <w:style w:type="table" w:styleId="Cuadrculamedia1-nfasis4">
     <w:name w:val="Medium Grid 1 Accent 4"/>
-    <w:basedOn w:val="TableNormal"/>
+    <w:basedOn w:val="Tablanormal"/>
     <w:uiPriority w:val="67"/>
     <w:rsid w:val="00CB0664"/>
     <w:pPr>
@@ -14963,9 +16659,9 @@
       </w:tcPr>
     </w:tblStylePr>
   </w:style>
-  <w:style w:type="table" w:styleId="MediumGrid1-Accent5">
+  <w:style w:type="table" w:styleId="Cuadrculamedia1-nfasis5">
     <w:name w:val="Medium Grid 1 Accent 5"/>
-    <w:basedOn w:val="TableNormal"/>
+    <w:basedOn w:val="Tablanormal"/>
     <w:uiPriority w:val="67"/>
     <w:rsid w:val="00CB0664"/>
     <w:pPr>
@@ -15029,9 +16725,9 @@
       </w:tcPr>
     </w:tblStylePr>
   </w:style>
-  <w:style w:type="table" w:styleId="MediumGrid1-Accent6">
+  <w:style w:type="table" w:styleId="Cuadrculamedia1-nfasis6">
     <w:name w:val="Medium Grid 1 Accent 6"/>
-    <w:basedOn w:val="TableNormal"/>
+    <w:basedOn w:val="Tablanormal"/>
     <w:uiPriority w:val="67"/>
     <w:rsid w:val="00CB0664"/>
     <w:pPr>
@@ -15095,9 +16791,9 @@
       </w:tcPr>
     </w:tblStylePr>
   </w:style>
-  <w:style w:type="table" w:styleId="MediumGrid2">
+  <w:style w:type="table" w:styleId="Cuadrculamedia2">
     <w:name w:val="Medium Grid 2"/>
-    <w:basedOn w:val="TableNormal"/>
+    <w:basedOn w:val="Tablanormal"/>
     <w:uiPriority w:val="68"/>
     <w:rsid w:val="00CB0664"/>
     <w:pPr>
@@ -15213,9 +16909,9 @@
       </w:tcPr>
     </w:tblStylePr>
   </w:style>
-  <w:style w:type="table" w:styleId="MediumGrid2-Accent1">
+  <w:style w:type="table" w:styleId="Cuadrculamedia2-nfasis1">
     <w:name w:val="Medium Grid 2 Accent 1"/>
-    <w:basedOn w:val="TableNormal"/>
+    <w:basedOn w:val="Tablanormal"/>
     <w:uiPriority w:val="68"/>
     <w:rsid w:val="00CB0664"/>
     <w:pPr>
@@ -15331,9 +17027,9 @@
       </w:tcPr>
     </w:tblStylePr>
   </w:style>
-  <w:style w:type="table" w:styleId="MediumGrid2-Accent2">
+  <w:style w:type="table" w:styleId="Cuadrculamedia2-nfasis2">
     <w:name w:val="Medium Grid 2 Accent 2"/>
-    <w:basedOn w:val="TableNormal"/>
+    <w:basedOn w:val="Tablanormal"/>
     <w:uiPriority w:val="68"/>
     <w:rsid w:val="00CB0664"/>
     <w:pPr>
@@ -15449,9 +17145,9 @@
       </w:tcPr>
     </w:tblStylePr>
   </w:style>
-  <w:style w:type="table" w:styleId="MediumGrid2-Accent3">
+  <w:style w:type="table" w:styleId="Cuadrculamedia2-nfasis3">
     <w:name w:val="Medium Grid 2 Accent 3"/>
-    <w:basedOn w:val="TableNormal"/>
+    <w:basedOn w:val="Tablanormal"/>
     <w:uiPriority w:val="68"/>
     <w:rsid w:val="00CB0664"/>
     <w:pPr>
@@ -15567,9 +17263,9 @@
       </w:tcPr>
     </w:tblStylePr>
   </w:style>
-  <w:style w:type="table" w:styleId="MediumGrid2-Accent4">
+  <w:style w:type="table" w:styleId="Cuadrculamedia2-nfasis4">
     <w:name w:val="Medium Grid 2 Accent 4"/>
-    <w:basedOn w:val="TableNormal"/>
+    <w:basedOn w:val="Tablanormal"/>
     <w:uiPriority w:val="68"/>
     <w:rsid w:val="00CB0664"/>
     <w:pPr>
@@ -15685,9 +17381,9 @@
       </w:tcPr>
     </w:tblStylePr>
   </w:style>
-  <w:style w:type="table" w:styleId="MediumGrid2-Accent5">
+  <w:style w:type="table" w:styleId="Cuadrculamedia2-nfasis5">
     <w:name w:val="Medium Grid 2 Accent 5"/>
-    <w:basedOn w:val="TableNormal"/>
+    <w:basedOn w:val="Tablanormal"/>
     <w:uiPriority w:val="68"/>
     <w:rsid w:val="00CB0664"/>
     <w:pPr>
@@ -15803,9 +17499,9 @@
       </w:tcPr>
     </w:tblStylePr>
   </w:style>
-  <w:style w:type="table" w:styleId="MediumGrid2-Accent6">
+  <w:style w:type="table" w:styleId="Cuadrculamedia2-nfasis6">
     <w:name w:val="Medium Grid 2 Accent 6"/>
-    <w:basedOn w:val="TableNormal"/>
+    <w:basedOn w:val="Tablanormal"/>
     <w:uiPriority w:val="68"/>
     <w:rsid w:val="00CB0664"/>
     <w:pPr>
@@ -15921,9 +17617,9 @@
       </w:tcPr>
     </w:tblStylePr>
   </w:style>
-  <w:style w:type="table" w:styleId="MediumGrid3">
+  <w:style w:type="table" w:styleId="Cuadrculamedia3">
     <w:name w:val="Medium Grid 3"/>
-    <w:basedOn w:val="TableNormal"/>
+    <w:basedOn w:val="Tablanormal"/>
     <w:uiPriority w:val="69"/>
     <w:rsid w:val="00CB0664"/>
     <w:pPr>
@@ -16055,9 +17751,9 @@
       </w:tcPr>
     </w:tblStylePr>
   </w:style>
-  <w:style w:type="table" w:styleId="MediumGrid3-Accent1">
+  <w:style w:type="table" w:styleId="Cuadrculamedia3-nfasis1">
     <w:name w:val="Medium Grid 3 Accent 1"/>
-    <w:basedOn w:val="TableNormal"/>
+    <w:basedOn w:val="Tablanormal"/>
     <w:uiPriority w:val="69"/>
     <w:rsid w:val="00CB0664"/>
     <w:pPr>
@@ -16189,9 +17885,9 @@
       </w:tcPr>
     </w:tblStylePr>
   </w:style>
-  <w:style w:type="table" w:styleId="MediumGrid3-Accent2">
+  <w:style w:type="table" w:styleId="Cuadrculamedia3-nfasis2">
     <w:name w:val="Medium Grid 3 Accent 2"/>
-    <w:basedOn w:val="TableNormal"/>
+    <w:basedOn w:val="Tablanormal"/>
     <w:uiPriority w:val="69"/>
     <w:rsid w:val="00CB0664"/>
     <w:pPr>
@@ -16323,9 +18019,9 @@
       </w:tcPr>
     </w:tblStylePr>
   </w:style>
-  <w:style w:type="table" w:styleId="MediumGrid3-Accent3">
+  <w:style w:type="table" w:styleId="Cuadrculamedia3-nfasis3">
     <w:name w:val="Medium Grid 3 Accent 3"/>
-    <w:basedOn w:val="TableNormal"/>
+    <w:basedOn w:val="Tablanormal"/>
     <w:uiPriority w:val="69"/>
     <w:rsid w:val="00CB0664"/>
     <w:pPr>
@@ -16457,9 +18153,9 @@
       </w:tcPr>
     </w:tblStylePr>
   </w:style>
-  <w:style w:type="table" w:styleId="MediumGrid3-Accent4">
+  <w:style w:type="table" w:styleId="Cuadrculamedia3-nfasis4">
     <w:name w:val="Medium Grid 3 Accent 4"/>
-    <w:basedOn w:val="TableNormal"/>
+    <w:basedOn w:val="Tablanormal"/>
     <w:uiPriority w:val="69"/>
     <w:rsid w:val="00CB0664"/>
     <w:pPr>
@@ -16591,9 +18287,9 @@
       </w:tcPr>
     </w:tblStylePr>
   </w:style>
-  <w:style w:type="table" w:styleId="MediumGrid3-Accent5">
+  <w:style w:type="table" w:styleId="Cuadrculamedia3-nfasis5">
     <w:name w:val="Medium Grid 3 Accent 5"/>
-    <w:basedOn w:val="TableNormal"/>
+    <w:basedOn w:val="Tablanormal"/>
     <w:uiPriority w:val="69"/>
     <w:rsid w:val="00CB0664"/>
     <w:pPr>
@@ -16725,9 +18421,9 @@
       </w:tcPr>
     </w:tblStylePr>
   </w:style>
-  <w:style w:type="table" w:styleId="MediumGrid3-Accent6">
+  <w:style w:type="table" w:styleId="Cuadrculamedia3-nfasis6">
     <w:name w:val="Medium Grid 3 Accent 6"/>
-    <w:basedOn w:val="TableNormal"/>
+    <w:basedOn w:val="Tablanormal"/>
     <w:uiPriority w:val="69"/>
     <w:rsid w:val="00CB0664"/>
     <w:pPr>
@@ -16859,9 +18555,9 @@
       </w:tcPr>
     </w:tblStylePr>
   </w:style>
-  <w:style w:type="table" w:styleId="DarkList">
+  <w:style w:type="table" w:styleId="Listaoscura">
     <w:name w:val="Dark List"/>
-    <w:basedOn w:val="TableNormal"/>
+    <w:basedOn w:val="Tablanormal"/>
     <w:uiPriority w:val="70"/>
     <w:rsid w:val="00CB0664"/>
     <w:pPr>
@@ -16966,9 +18662,9 @@
       </w:tcPr>
     </w:tblStylePr>
   </w:style>
-  <w:style w:type="table" w:styleId="DarkList-Accent1">
+  <w:style w:type="table" w:styleId="Listaoscura-nfasis1">
     <w:name w:val="Dark List Accent 1"/>
-    <w:basedOn w:val="TableNormal"/>
+    <w:basedOn w:val="Tablanormal"/>
     <w:uiPriority w:val="70"/>
     <w:rsid w:val="00CB0664"/>
     <w:pPr>
@@ -17073,9 +18769,9 @@
       </w:tcPr>
     </w:tblStylePr>
   </w:style>
-  <w:style w:type="table" w:styleId="DarkList-Accent2">
+  <w:style w:type="table" w:styleId="Listaoscura-nfasis2">
     <w:name w:val="Dark List Accent 2"/>
-    <w:basedOn w:val="TableNormal"/>
+    <w:basedOn w:val="Tablanormal"/>
     <w:uiPriority w:val="70"/>
     <w:rsid w:val="00CB0664"/>
     <w:pPr>
@@ -17180,9 +18876,9 @@
       </w:tcPr>
     </w:tblStylePr>
   </w:style>
-  <w:style w:type="table" w:styleId="DarkList-Accent3">
+  <w:style w:type="table" w:styleId="Listaoscura-nfasis3">
     <w:name w:val="Dark List Accent 3"/>
-    <w:basedOn w:val="TableNormal"/>
+    <w:basedOn w:val="Tablanormal"/>
     <w:uiPriority w:val="70"/>
     <w:rsid w:val="00CB0664"/>
     <w:pPr>
@@ -17287,9 +18983,9 @@
       </w:tcPr>
     </w:tblStylePr>
   </w:style>
-  <w:style w:type="table" w:styleId="DarkList-Accent4">
+  <w:style w:type="table" w:styleId="Listaoscura-nfasis4">
     <w:name w:val="Dark List Accent 4"/>
-    <w:basedOn w:val="TableNormal"/>
+    <w:basedOn w:val="Tablanormal"/>
     <w:uiPriority w:val="70"/>
     <w:rsid w:val="00CB0664"/>
     <w:pPr>
@@ -17394,9 +19090,9 @@
       </w:tcPr>
     </w:tblStylePr>
   </w:style>
-  <w:style w:type="table" w:styleId="DarkList-Accent5">
+  <w:style w:type="table" w:styleId="Listaoscura-nfasis5">
     <w:name w:val="Dark List Accent 5"/>
-    <w:basedOn w:val="TableNormal"/>
+    <w:basedOn w:val="Tablanormal"/>
     <w:uiPriority w:val="70"/>
     <w:rsid w:val="00CB0664"/>
     <w:pPr>
@@ -17501,9 +19197,9 @@
       </w:tcPr>
     </w:tblStylePr>
   </w:style>
-  <w:style w:type="table" w:styleId="DarkList-Accent6">
+  <w:style w:type="table" w:styleId="Listaoscura-nfasis6">
     <w:name w:val="Dark List Accent 6"/>
-    <w:basedOn w:val="TableNormal"/>
+    <w:basedOn w:val="Tablanormal"/>
     <w:uiPriority w:val="70"/>
     <w:rsid w:val="00CB0664"/>
     <w:pPr>
@@ -17608,9 +19304,9 @@
       </w:tcPr>
     </w:tblStylePr>
   </w:style>
-  <w:style w:type="table" w:styleId="ColorfulShading">
+  <w:style w:type="table" w:styleId="Sombreadovistoso">
     <w:name w:val="Colorful Shading"/>
-    <w:basedOn w:val="TableNormal"/>
+    <w:basedOn w:val="Tablanormal"/>
     <w:uiPriority w:val="71"/>
     <w:rsid w:val="00CB0664"/>
     <w:pPr>
@@ -17723,9 +19419,9 @@
       </w:rPr>
     </w:tblStylePr>
   </w:style>
-  <w:style w:type="table" w:styleId="ColorfulShading-Accent1">
+  <w:style w:type="table" w:styleId="Sombreadovistoso-nfasis1">
     <w:name w:val="Colorful Shading Accent 1"/>
-    <w:basedOn w:val="TableNormal"/>
+    <w:basedOn w:val="Tablanormal"/>
     <w:uiPriority w:val="71"/>
     <w:rsid w:val="00CB0664"/>
     <w:pPr>
@@ -17838,9 +19534,9 @@
       </w:rPr>
     </w:tblStylePr>
   </w:style>
-  <w:style w:type="table" w:styleId="ColorfulShading-Accent2">
+  <w:style w:type="table" w:styleId="Sombreadovistoso-nfasis2">
     <w:name w:val="Colorful Shading Accent 2"/>
-    <w:basedOn w:val="TableNormal"/>
+    <w:basedOn w:val="Tablanormal"/>
     <w:uiPriority w:val="71"/>
     <w:rsid w:val="00CB0664"/>
     <w:pPr>
@@ -17953,9 +19649,9 @@
       </w:rPr>
     </w:tblStylePr>
   </w:style>
-  <w:style w:type="table" w:styleId="ColorfulShading-Accent3">
+  <w:style w:type="table" w:styleId="Sombreadovistoso-nfasis3">
     <w:name w:val="Colorful Shading Accent 3"/>
-    <w:basedOn w:val="TableNormal"/>
+    <w:basedOn w:val="Tablanormal"/>
     <w:uiPriority w:val="71"/>
     <w:rsid w:val="00CB0664"/>
     <w:pPr>
@@ -18058,9 +19754,9 @@
       </w:tcPr>
     </w:tblStylePr>
   </w:style>
-  <w:style w:type="table" w:styleId="ColorfulShading-Accent4">
+  <w:style w:type="table" w:styleId="Sombreadovistoso-nfasis4">
     <w:name w:val="Colorful Shading Accent 4"/>
-    <w:basedOn w:val="TableNormal"/>
+    <w:basedOn w:val="Tablanormal"/>
     <w:uiPriority w:val="71"/>
     <w:rsid w:val="00CB0664"/>
     <w:pPr>
@@ -18173,9 +19869,9 @@
       </w:rPr>
     </w:tblStylePr>
   </w:style>
-  <w:style w:type="table" w:styleId="ColorfulShading-Accent5">
+  <w:style w:type="table" w:styleId="Sombreadovistoso-nfasis5">
     <w:name w:val="Colorful Shading Accent 5"/>
-    <w:basedOn w:val="TableNormal"/>
+    <w:basedOn w:val="Tablanormal"/>
     <w:uiPriority w:val="71"/>
     <w:rsid w:val="00CB0664"/>
     <w:pPr>
@@ -18288,9 +19984,9 @@
       </w:rPr>
     </w:tblStylePr>
   </w:style>
-  <w:style w:type="table" w:styleId="ColorfulShading-Accent6">
+  <w:style w:type="table" w:styleId="Sombreadovistoso-nfasis6">
     <w:name w:val="Colorful Shading Accent 6"/>
-    <w:basedOn w:val="TableNormal"/>
+    <w:basedOn w:val="Tablanormal"/>
     <w:uiPriority w:val="71"/>
     <w:rsid w:val="00CB0664"/>
     <w:pPr>
@@ -18403,9 +20099,9 @@
       </w:rPr>
     </w:tblStylePr>
   </w:style>
-  <w:style w:type="table" w:styleId="ColorfulList">
+  <w:style w:type="table" w:styleId="Listavistosa">
     <w:name w:val="Colorful List"/>
-    <w:basedOn w:val="TableNormal"/>
+    <w:basedOn w:val="Tablanormal"/>
     <w:uiPriority w:val="72"/>
     <w:rsid w:val="00CB0664"/>
     <w:pPr>
@@ -18482,9 +20178,9 @@
       </w:tcPr>
     </w:tblStylePr>
   </w:style>
-  <w:style w:type="table" w:styleId="ColorfulList-Accent1">
+  <w:style w:type="table" w:styleId="Listavistosa-nfasis1">
     <w:name w:val="Colorful List Accent 1"/>
-    <w:basedOn w:val="TableNormal"/>
+    <w:basedOn w:val="Tablanormal"/>
     <w:uiPriority w:val="72"/>
     <w:rsid w:val="00CB0664"/>
     <w:pPr>
@@ -18561,9 +20257,9 @@
       </w:tcPr>
     </w:tblStylePr>
   </w:style>
-  <w:style w:type="table" w:styleId="ColorfulList-Accent2">
+  <w:style w:type="table" w:styleId="Listavistosa-nfasis2">
     <w:name w:val="Colorful List Accent 2"/>
-    <w:basedOn w:val="TableNormal"/>
+    <w:basedOn w:val="Tablanormal"/>
     <w:uiPriority w:val="72"/>
     <w:rsid w:val="00CB0664"/>
     <w:pPr>
@@ -18640,9 +20336,9 @@
       </w:tcPr>
     </w:tblStylePr>
   </w:style>
-  <w:style w:type="table" w:styleId="ColorfulList-Accent3">
+  <w:style w:type="table" w:styleId="Listavistosa-nfasis3">
     <w:name w:val="Colorful List Accent 3"/>
-    <w:basedOn w:val="TableNormal"/>
+    <w:basedOn w:val="Tablanormal"/>
     <w:uiPriority w:val="72"/>
     <w:rsid w:val="00CB0664"/>
     <w:pPr>
@@ -18719,9 +20415,9 @@
       </w:tcPr>
     </w:tblStylePr>
   </w:style>
-  <w:style w:type="table" w:styleId="ColorfulList-Accent4">
+  <w:style w:type="table" w:styleId="Listavistosa-nfasis4">
     <w:name w:val="Colorful List Accent 4"/>
-    <w:basedOn w:val="TableNormal"/>
+    <w:basedOn w:val="Tablanormal"/>
     <w:uiPriority w:val="72"/>
     <w:rsid w:val="00CB0664"/>
     <w:pPr>
@@ -18798,9 +20494,9 @@
       </w:tcPr>
     </w:tblStylePr>
   </w:style>
-  <w:style w:type="table" w:styleId="ColorfulList-Accent5">
+  <w:style w:type="table" w:styleId="Listavistosa-nfasis5">
     <w:name w:val="Colorful List Accent 5"/>
-    <w:basedOn w:val="TableNormal"/>
+    <w:basedOn w:val="Tablanormal"/>
     <w:uiPriority w:val="72"/>
     <w:rsid w:val="00CB0664"/>
     <w:pPr>
@@ -18877,9 +20573,9 @@
       </w:tcPr>
     </w:tblStylePr>
   </w:style>
-  <w:style w:type="table" w:styleId="ColorfulList-Accent6">
+  <w:style w:type="table" w:styleId="Listavistosa-nfasis6">
     <w:name w:val="Colorful List Accent 6"/>
-    <w:basedOn w:val="TableNormal"/>
+    <w:basedOn w:val="Tablanormal"/>
     <w:uiPriority w:val="72"/>
     <w:rsid w:val="00CB0664"/>
     <w:pPr>
@@ -18956,9 +20652,9 @@
       </w:tcPr>
     </w:tblStylePr>
   </w:style>
-  <w:style w:type="table" w:styleId="ColorfulGrid">
+  <w:style w:type="table" w:styleId="Cuadrculavistosa">
     <w:name w:val="Colorful Grid"/>
-    <w:basedOn w:val="TableNormal"/>
+    <w:basedOn w:val="Tablanormal"/>
     <w:uiPriority w:val="73"/>
     <w:rsid w:val="00CB0664"/>
     <w:pPr>
@@ -19029,9 +20725,9 @@
       </w:tcPr>
     </w:tblStylePr>
   </w:style>
-  <w:style w:type="table" w:styleId="ColorfulGrid-Accent1">
+  <w:style w:type="table" w:styleId="Cuadrculavistosa-nfasis1">
     <w:name w:val="Colorful Grid Accent 1"/>
-    <w:basedOn w:val="TableNormal"/>
+    <w:basedOn w:val="Tablanormal"/>
     <w:uiPriority w:val="73"/>
     <w:rsid w:val="00CB0664"/>
     <w:pPr>
@@ -19102,9 +20798,9 @@
       </w:tcPr>
     </w:tblStylePr>
   </w:style>
-  <w:style w:type="table" w:styleId="ColorfulGrid-Accent2">
+  <w:style w:type="table" w:styleId="Cuadrculavistosa-nfasis2">
     <w:name w:val="Colorful Grid Accent 2"/>
-    <w:basedOn w:val="TableNormal"/>
+    <w:basedOn w:val="Tablanormal"/>
     <w:uiPriority w:val="73"/>
     <w:rsid w:val="00CB0664"/>
     <w:pPr>
@@ -19175,9 +20871,9 @@
       </w:tcPr>
     </w:tblStylePr>
   </w:style>
-  <w:style w:type="table" w:styleId="ColorfulGrid-Accent3">
+  <w:style w:type="table" w:styleId="Cuadrculavistosa-nfasis3">
     <w:name w:val="Colorful Grid Accent 3"/>
-    <w:basedOn w:val="TableNormal"/>
+    <w:basedOn w:val="Tablanormal"/>
     <w:uiPriority w:val="73"/>
     <w:rsid w:val="00CB0664"/>
     <w:pPr>
@@ -19248,9 +20944,9 @@
       </w:tcPr>
     </w:tblStylePr>
   </w:style>
-  <w:style w:type="table" w:styleId="ColorfulGrid-Accent4">
+  <w:style w:type="table" w:styleId="Cuadrculavistosa-nfasis4">
     <w:name w:val="Colorful Grid Accent 4"/>
-    <w:basedOn w:val="TableNormal"/>
+    <w:basedOn w:val="Tablanormal"/>
     <w:uiPriority w:val="73"/>
     <w:rsid w:val="00CB0664"/>
     <w:pPr>
@@ -19321,9 +21017,9 @@
       </w:tcPr>
     </w:tblStylePr>
   </w:style>
-  <w:style w:type="table" w:styleId="ColorfulGrid-Accent5">
+  <w:style w:type="table" w:styleId="Cuadrculavistosa-nfasis5">
     <w:name w:val="Colorful Grid Accent 5"/>
-    <w:basedOn w:val="TableNormal"/>
+    <w:basedOn w:val="Tablanormal"/>
     <w:uiPriority w:val="73"/>
     <w:rsid w:val="00CB0664"/>
     <w:pPr>
@@ -19394,9 +21090,9 @@
       </w:tcPr>
     </w:tblStylePr>
   </w:style>
-  <w:style w:type="table" w:styleId="ColorfulGrid-Accent6">
+  <w:style w:type="table" w:styleId="Cuadrculavistosa-nfasis6">
     <w:name w:val="Colorful Grid Accent 6"/>
-    <w:basedOn w:val="TableNormal"/>
+    <w:basedOn w:val="Tablanormal"/>
     <w:uiPriority w:val="73"/>
     <w:rsid w:val="00CB0664"/>
     <w:pPr>
@@ -19466,6 +21162,29 @@
         <w:shd w:val="clear" w:color="auto" w:fill="FBCAA2" w:themeFill="accent6" w:themeFillTint="7F"/>
       </w:tcPr>
     </w:tblStylePr>
+  </w:style>
+  <w:style w:type="character" w:styleId="Hipervnculo">
+    <w:name w:val="Hyperlink"/>
+    <w:basedOn w:val="Fuentedeprrafopredeter"/>
+    <w:uiPriority w:val="99"/>
+    <w:unhideWhenUsed/>
+    <w:rsid w:val="00AD6EBE"/>
+    <w:rPr>
+      <w:color w:val="0000FF" w:themeColor="hyperlink"/>
+      <w:u w:val="single"/>
+    </w:rPr>
+  </w:style>
+  <w:style w:type="character" w:styleId="Mencinsinresolver">
+    <w:name w:val="Unresolved Mention"/>
+    <w:basedOn w:val="Fuentedeprrafopredeter"/>
+    <w:uiPriority w:val="99"/>
+    <w:semiHidden/>
+    <w:unhideWhenUsed/>
+    <w:rsid w:val="00AD6EBE"/>
+    <w:rPr>
+      <w:color w:val="605E5C"/>
+      <w:shd w:val="clear" w:color="auto" w:fill="E1DFDD"/>
+    </w:rPr>
   </w:style>
 </w:styles>
 </file>

</xml_diff>